<commit_message>
update after-hearing Oakland instructions; wrap continue/back button references in "word()" for translation
</commit_message>
<xml_diff>
--- a/docassemble/MLHPPOAndProposedOrder/data/templates/oakland_county_instructions_after_hearing.docx
+++ b/docassemble/MLHPPOAndProposedOrder/data/templates/oakland_county_instructions_after_hearing.docx
@@ -9,29 +9,16 @@
       <w:r>
         <w:t>Oakland County Instructions - How to Ask for a Personal Protection Order (</w:t>
       </w:r>
-      <w:proofErr w:type="gramStart"/>
       <w:r>
         <w:t xml:space="preserve">{{ </w:t>
       </w:r>
       <w:proofErr w:type="spellStart"/>
       <w:r>
-        <w:t>ppo</w:t>
-      </w:r>
-      <w:proofErr w:type="gramEnd"/>
-      <w:r>
-        <w:t>_type_</w:t>
-      </w:r>
-      <w:proofErr w:type="gramStart"/>
-      <w:r>
-        <w:t>full</w:t>
+        <w:t>ppo_type_full</w:t>
       </w:r>
       <w:proofErr w:type="spellEnd"/>
       <w:r>
-        <w:t xml:space="preserve"> }</w:t>
-      </w:r>
-      <w:proofErr w:type="gramEnd"/>
-      <w:r>
-        <w:t>}</w:t>
+        <w:t xml:space="preserve"> }}</w:t>
       </w:r>
       <w:r>
         <w:t>) with a Hearing</w:t>
@@ -41,37 +28,19 @@
       <w:pPr>
         <w:pStyle w:val="Normalforinsertedinstructions"/>
       </w:pPr>
-      <w:proofErr w:type="gramStart"/>
-      <w:r>
-        <w:t>Following</w:t>
-      </w:r>
-      <w:proofErr w:type="gramEnd"/>
-      <w:r>
-        <w:t xml:space="preserve"> are step-by-step instructions to help you file a Petition for a Personal Protection Order (</w:t>
-      </w:r>
-      <w:proofErr w:type="gramStart"/>
+      <w:r>
+        <w:t>Following are step-by-step instructions to help you file a Petition for a Personal Protection Order (</w:t>
+      </w:r>
       <w:r>
         <w:t xml:space="preserve">{{ </w:t>
       </w:r>
       <w:proofErr w:type="spellStart"/>
       <w:r>
-        <w:t>ppo</w:t>
-      </w:r>
-      <w:proofErr w:type="gramEnd"/>
-      <w:r>
-        <w:t>_type_</w:t>
-      </w:r>
-      <w:proofErr w:type="gramStart"/>
-      <w:r>
-        <w:t>full</w:t>
+        <w:t>ppo_type_full</w:t>
       </w:r>
       <w:proofErr w:type="spellEnd"/>
       <w:r>
-        <w:t xml:space="preserve"> }</w:t>
-      </w:r>
-      <w:proofErr w:type="gramEnd"/>
-      <w:r>
-        <w:t>}</w:t>
+        <w:t xml:space="preserve"> }}</w:t>
       </w:r>
       <w:r>
         <w:t xml:space="preserve">) </w:t>
@@ -470,15 +439,7 @@
         <w:pStyle w:val="BulletedList"/>
       </w:pPr>
       <w:r>
-        <w:t xml:space="preserve">Exhibits to Personal Protection Order (if you </w:t>
-      </w:r>
-      <w:proofErr w:type="gramStart"/>
-      <w:r>
-        <w:t>uploaded</w:t>
-      </w:r>
-      <w:proofErr w:type="gramEnd"/>
-      <w:r>
-        <w:t xml:space="preserve"> any documents)</w:t>
+        <w:t>Exhibits to Personal Protection Order (if you uploaded any documents)</w:t>
       </w:r>
     </w:p>
     <w:p>
@@ -515,17 +476,12 @@
       </w:r>
       <w:proofErr w:type="spellStart"/>
       <w:r>
-        <w:t>has_next_friend_</w:t>
-      </w:r>
-      <w:proofErr w:type="gramStart"/>
-      <w:r>
-        <w:t>petitioning</w:t>
+        <w:t>has_next_friend_petitioning</w:t>
       </w:r>
       <w:proofErr w:type="spellEnd"/>
       <w:r>
         <w:t xml:space="preserve"> %}</w:t>
       </w:r>
-      <w:proofErr w:type="gramEnd"/>
     </w:p>
     <w:p>
       <w:pPr>
@@ -540,13 +496,8 @@
         <w:pStyle w:val="Normalforinsertedinstructions"/>
       </w:pPr>
       <w:r>
-        <w:t xml:space="preserve">{%p </w:t>
-      </w:r>
-      <w:proofErr w:type="gramStart"/>
-      <w:r>
-        <w:t>endif %}</w:t>
-      </w:r>
-      <w:proofErr w:type="gramEnd"/>
+        <w:t>{%p endif %}</w:t>
+      </w:r>
     </w:p>
     <w:p>
       <w:pPr>
@@ -631,17 +582,12 @@
       </w:r>
       <w:proofErr w:type="spellStart"/>
       <w:r>
-        <w:t>has_next_friend_</w:t>
-      </w:r>
-      <w:proofErr w:type="gramStart"/>
-      <w:r>
-        <w:t>petitioning</w:t>
+        <w:t>has_next_friend_petitioning</w:t>
       </w:r>
       <w:proofErr w:type="spellEnd"/>
       <w:r>
         <w:t xml:space="preserve"> %}</w:t>
       </w:r>
-      <w:proofErr w:type="gramEnd"/>
     </w:p>
     <w:p>
       <w:pPr>
@@ -656,13 +602,8 @@
         <w:pStyle w:val="Normalforinsertedinstructions"/>
       </w:pPr>
       <w:r>
-        <w:t xml:space="preserve">{%p </w:t>
-      </w:r>
-      <w:proofErr w:type="gramStart"/>
-      <w:r>
-        <w:t>endif %}</w:t>
-      </w:r>
-      <w:proofErr w:type="gramEnd"/>
+        <w:t>{%p endif %}</w:t>
+      </w:r>
     </w:p>
     <w:p>
       <w:pPr>
@@ -702,35 +643,11 @@
       </w:r>
       <w:proofErr w:type="spellStart"/>
       <w:r>
-        <w:t>is_incapacitated_</w:t>
-      </w:r>
-      <w:proofErr w:type="gramStart"/>
-      <w:r>
-        <w:t>adult</w:t>
+        <w:t>is_incapacitated_adult</w:t>
       </w:r>
       <w:proofErr w:type="spellEnd"/>
       <w:r>
-        <w:t xml:space="preserve"> %}</w:t>
-      </w:r>
-      <w:proofErr w:type="gramEnd"/>
-      <w:r>
-        <w:t xml:space="preserve"> Make sure you upload the Order Regarding Appointment of Guardian or the power of attorney </w:t>
-      </w:r>
-      <w:proofErr w:type="gramStart"/>
-      <w:r>
-        <w:t>paperwork.{</w:t>
-      </w:r>
-      <w:proofErr w:type="gramEnd"/>
-      <w:r>
-        <w:t xml:space="preserve">% </w:t>
-      </w:r>
-      <w:proofErr w:type="gramStart"/>
-      <w:r>
-        <w:t>endif %}</w:t>
-      </w:r>
-      <w:proofErr w:type="gramEnd"/>
-      <w:r>
-        <w:t xml:space="preserve"> </w:t>
+        <w:t xml:space="preserve"> %} Make sure you upload the Order Regarding Appointment of Guardian or the power of attorney paperwork.{% endif %} </w:t>
       </w:r>
     </w:p>
     <w:p>
@@ -827,455 +744,56 @@
         <w:pStyle w:val="Normalforinsertedinstructions"/>
       </w:pPr>
       <w:r>
-        <w:t>Make a copy of each of the following completed forms:</w:t>
-      </w:r>
-    </w:p>
-    <w:p>
-      <w:pPr>
-        <w:pStyle w:val="BulletedList"/>
-      </w:pPr>
-      <w:r>
-        <w:t>Petition for Personal Protection Order (including the Statement of Facts and any attachments, such as police reports and medical records related to your petition)</w:t>
-      </w:r>
-    </w:p>
-    <w:p>
-      <w:pPr>
-        <w:pStyle w:val="BulletedList"/>
-      </w:pPr>
-      <w:r>
-        <w:t>Notice of Hearing and Zoom Hearing Instructions (if applicable)</w:t>
-      </w:r>
-    </w:p>
-    <w:p>
-      <w:pPr>
-        <w:pStyle w:val="Normalforinsertedinstructions"/>
-      </w:pPr>
-      <w:r>
-        <w:t>The copies will be served (given or sent to) the Respondent.</w:t>
-      </w:r>
-    </w:p>
-    <w:p>
-      <w:pPr>
-        <w:pStyle w:val="Normalforinsertedinstructions"/>
-      </w:pPr>
-      <w:r>
-        <w:t xml:space="preserve">If you are going to arrange to have the Oakland County Sheriff’s Office Civil Unit serve the Respondent with the papers, contact the Civil Unit </w:t>
-      </w:r>
-      <w:r>
-        <w:rPr>
-          <w:b/>
-        </w:rPr>
-        <w:t>before</w:t>
-      </w:r>
-      <w:r>
-        <w:t xml:space="preserve"> you make copies of the PPO documents to get instructions from them. Read Step 5 to learn more about this.</w:t>
-      </w:r>
-    </w:p>
-    <w:p>
-      <w:pPr>
-        <w:pStyle w:val="Heading3"/>
-      </w:pPr>
-      <w:r>
-        <w:t xml:space="preserve">Step 5: Have the Respondent served </w:t>
-      </w:r>
-    </w:p>
-    <w:p>
-      <w:pPr>
-        <w:pStyle w:val="Normalforinsertedinstructions"/>
-        <w:rPr>
-          <w:color w:val="000000"/>
-        </w:rPr>
-      </w:pPr>
-      <w:r>
-        <w:rPr>
-          <w:color w:val="000000"/>
-        </w:rPr>
-        <w:t>Have the PPO documents served to the Respondent at least five days before the hearing.</w:t>
-      </w:r>
-    </w:p>
-    <w:p>
-      <w:pPr>
-        <w:pStyle w:val="Normalforinsertedinstructions"/>
-        <w:rPr>
-          <w:color w:val="000000"/>
-        </w:rPr>
-      </w:pPr>
-      <w:r>
-        <w:rPr>
-          <w:color w:val="000000"/>
-        </w:rPr>
-        <w:t xml:space="preserve">If you choose to, you may have the Oakland County Sheriff’s Office serve the Respondent. Contact information for the Oakland County Sheriff’s Office Civil Unit will be provided in the same PPO document email from the PPO Office. Contact the Oakland County Sheriff’s Office Civil Unit </w:t>
-      </w:r>
-      <w:r>
-        <w:rPr>
-          <w:b/>
-          <w:color w:val="FF0000"/>
-          <w:u w:val="single"/>
-        </w:rPr>
-        <w:t>BEFORE</w:t>
-      </w:r>
-      <w:r>
-        <w:rPr>
-          <w:color w:val="000000"/>
-        </w:rPr>
-        <w:t xml:space="preserve"> you make copies of the PPO documents to get additional instructions from them.</w:t>
-      </w:r>
-    </w:p>
-    <w:p>
-      <w:pPr>
-        <w:pStyle w:val="Normalforinsertedinstructions"/>
-        <w:rPr>
-          <w:b/>
-          <w:color w:val="000000"/>
-        </w:rPr>
-      </w:pPr>
-      <w:r>
-        <w:rPr>
-          <w:color w:val="000000"/>
-        </w:rPr>
-        <w:t xml:space="preserve">If you don’t want the Sheriff’s Office Civil Unit to serve for you, service can be completed by a professional process server, or an adult friend or relative. </w:t>
-      </w:r>
-      <w:r>
-        <w:t xml:space="preserve">{% if </w:t>
+        <w:rPr>
+          <w:b/>
+          <w:bCs/>
+        </w:rPr>
+        <w:t xml:space="preserve">If you want a hearing after the judge denied your </w:t>
+      </w:r>
+      <w:r>
+        <w:rPr>
+          <w:b/>
+          <w:bCs/>
+        </w:rPr>
+        <w:t xml:space="preserve">ex </w:t>
       </w:r>
       <w:proofErr w:type="spellStart"/>
       <w:r>
-        <w:t>has_next_friend_petitioning</w:t>
+        <w:rPr>
+          <w:b/>
+          <w:bCs/>
+        </w:rPr>
+        <w:t>parte</w:t>
       </w:r>
       <w:proofErr w:type="spellEnd"/>
       <w:r>
-        <w:t xml:space="preserve"> </w:t>
-      </w:r>
-      <w:proofErr w:type="gramStart"/>
-      <w:r>
-        <w:t>%}</w:t>
-      </w:r>
-      <w:r>
         <w:rPr>
           <w:b/>
           <w:bCs/>
-          <w:color w:val="000000"/>
-        </w:rPr>
-        <w:t>Neither</w:t>
-      </w:r>
-      <w:proofErr w:type="gramEnd"/>
-      <w:r>
-        <w:rPr>
-          <w:b/>
-          <w:bCs/>
-          <w:color w:val="000000"/>
-        </w:rPr>
-        <w:t xml:space="preserve"> you nor your next friend is allowed to serve the Respondent.</w:t>
-      </w:r>
-      <w:r>
-        <w:rPr>
-          <w:b/>
-          <w:bCs/>
-          <w:color w:val="000000"/>
-        </w:rPr>
-        <w:t xml:space="preserve"> </w:t>
-      </w:r>
-      <w:r>
-        <w:t>{%</w:t>
-      </w:r>
-      <w:r>
-        <w:t xml:space="preserve"> else</w:t>
-      </w:r>
-      <w:r>
-        <w:t xml:space="preserve"> </w:t>
-      </w:r>
-      <w:proofErr w:type="gramStart"/>
-      <w:r>
-        <w:t>%}</w:t>
-      </w:r>
-      <w:r>
-        <w:rPr>
-          <w:b/>
-          <w:color w:val="000000"/>
-        </w:rPr>
-        <w:t>You</w:t>
-      </w:r>
-      <w:proofErr w:type="gramEnd"/>
-      <w:r>
-        <w:rPr>
-          <w:b/>
-          <w:color w:val="000000"/>
-        </w:rPr>
-        <w:t xml:space="preserve"> cannot serve the Respondent yourself.</w:t>
-      </w:r>
-      <w:r>
-        <w:t xml:space="preserve"> </w:t>
-      </w:r>
-      <w:r>
-        <w:t>{% endif %}</w:t>
-      </w:r>
-    </w:p>
-    <w:p>
-      <w:pPr>
-        <w:pStyle w:val="Normalforinsertedinstructions"/>
-        <w:rPr>
-          <w:color w:val="000000"/>
-        </w:rPr>
-      </w:pPr>
-      <w:r>
-        <w:rPr>
-          <w:color w:val="000000"/>
-        </w:rPr>
-        <w:t>You will need the Respondent's address and any other information that will help the process server find the Respondent.</w:t>
-      </w:r>
-    </w:p>
-    <w:p>
-      <w:pPr>
-        <w:pStyle w:val="Normalforinsertedinstructions"/>
-        <w:rPr>
-          <w:color w:val="000000"/>
-        </w:rPr>
-      </w:pPr>
-      <w:r>
-        <w:rPr>
-          <w:color w:val="000000"/>
-        </w:rPr>
-        <w:t xml:space="preserve">The process server can give the Respondent the papers in person. Or the papers can be sent to the Respondent by registered mail with return receipt requested and delivery restricted to the Respondent. If the Respondent is served by mail, they must sign and return the green card (the return receipt). Even if the Respondent is served by mail, you need to find someone else to do the mailing. </w:t>
-      </w:r>
-      <w:r>
-        <w:rPr>
-          <w:color w:val="202124"/>
-        </w:rPr>
-        <w:t>The server’s address—not yours—should be the one on the r</w:t>
-      </w:r>
-      <w:r>
-        <w:rPr>
-          <w:color w:val="000000"/>
-        </w:rPr>
-        <w:t xml:space="preserve">eturn receipt. </w:t>
-      </w:r>
-    </w:p>
-    <w:p>
-      <w:pPr>
-        <w:pStyle w:val="Normalforinsertedinstructions"/>
-        <w:rPr>
-          <w:color w:val="000000"/>
-        </w:rPr>
-      </w:pPr>
-      <w:proofErr w:type="gramStart"/>
-      <w:r>
-        <w:rPr>
-          <w:color w:val="000000"/>
-        </w:rPr>
-        <w:t>{%p if</w:t>
-      </w:r>
-      <w:proofErr w:type="gramEnd"/>
-      <w:r>
-        <w:rPr>
-          <w:color w:val="000000"/>
-        </w:rPr>
-        <w:t xml:space="preserve"> </w:t>
-      </w:r>
-      <w:proofErr w:type="spellStart"/>
-      <w:r>
-        <w:rPr>
-          <w:color w:val="000000"/>
-        </w:rPr>
-        <w:t>respondent_is_minor</w:t>
-      </w:r>
-      <w:proofErr w:type="spellEnd"/>
-      <w:r>
-        <w:rPr>
-          <w:color w:val="000000"/>
-        </w:rPr>
-        <w:t xml:space="preserve"> and not </w:t>
-      </w:r>
-      <w:proofErr w:type="spellStart"/>
-      <w:r>
-        <w:rPr>
-          <w:color w:val="000000"/>
-        </w:rPr>
-        <w:t>respondent_is_emancipated_</w:t>
-      </w:r>
-      <w:proofErr w:type="gramStart"/>
-      <w:r>
-        <w:rPr>
-          <w:color w:val="000000"/>
-        </w:rPr>
-        <w:t>minor</w:t>
-      </w:r>
-      <w:proofErr w:type="spellEnd"/>
-      <w:r>
-        <w:rPr>
-          <w:color w:val="000000"/>
-        </w:rPr>
-        <w:t xml:space="preserve"> %}</w:t>
-      </w:r>
-      <w:proofErr w:type="gramEnd"/>
-    </w:p>
-    <w:p>
-      <w:pPr>
-        <w:pStyle w:val="Normalforinsertedinstructions"/>
-        <w:rPr>
-          <w:color w:val="000000"/>
-        </w:rPr>
-      </w:pPr>
-      <w:r>
-        <w:rPr>
-          <w:b/>
-          <w:color w:val="000000"/>
-        </w:rPr>
-        <w:t>If the Respondent is a minor</w:t>
-      </w:r>
-      <w:r>
-        <w:rPr>
-          <w:color w:val="000000"/>
-        </w:rPr>
-        <w:t xml:space="preserve">, you must also have copies of the forms served on the Respondent’s parent(s), guardian(s), or custodian(s), if you know their location. </w:t>
-      </w:r>
-    </w:p>
-    <w:p>
-      <w:pPr>
-        <w:pStyle w:val="Normalforinsertedinstructions"/>
-        <w:rPr>
-          <w:color w:val="000000"/>
-        </w:rPr>
-      </w:pPr>
-      <w:r>
-        <w:rPr>
-          <w:color w:val="000000"/>
-        </w:rPr>
-        <w:t xml:space="preserve">{%p </w:t>
-      </w:r>
-      <w:proofErr w:type="gramStart"/>
-      <w:r>
-        <w:rPr>
-          <w:color w:val="000000"/>
-        </w:rPr>
-        <w:t>endif %}</w:t>
-      </w:r>
-      <w:proofErr w:type="gramEnd"/>
-    </w:p>
-    <w:p>
-      <w:pPr>
-        <w:pStyle w:val="Heading3"/>
-      </w:pPr>
-      <w:r>
-        <w:lastRenderedPageBreak/>
-        <w:t xml:space="preserve">Step 6: File </w:t>
-      </w:r>
-      <w:proofErr w:type="gramStart"/>
-      <w:r>
-        <w:t>the completed</w:t>
-      </w:r>
-      <w:proofErr w:type="gramEnd"/>
-      <w:r>
-        <w:t xml:space="preserve"> Proof of Service</w:t>
-      </w:r>
-    </w:p>
-    <w:p>
-      <w:pPr>
-        <w:pStyle w:val="Normalforinsertedinstructions"/>
-        <w:rPr>
-          <w:color w:val="000000"/>
-        </w:rPr>
-      </w:pPr>
-      <w:r>
-        <w:rPr>
-          <w:color w:val="000000"/>
-        </w:rPr>
-        <w:t xml:space="preserve">{%p if </w:t>
-      </w:r>
-      <w:proofErr w:type="spellStart"/>
-      <w:r>
-        <w:t>has_next_friend_</w:t>
-      </w:r>
-      <w:proofErr w:type="gramStart"/>
-      <w:r>
-        <w:t>petitioning</w:t>
-      </w:r>
-      <w:proofErr w:type="spellEnd"/>
-      <w:r>
-        <w:rPr>
-          <w:color w:val="000000"/>
-        </w:rPr>
-        <w:t xml:space="preserve"> %}</w:t>
-      </w:r>
-      <w:proofErr w:type="gramEnd"/>
-    </w:p>
-    <w:p>
-      <w:pPr>
-        <w:pStyle w:val="Normalforinsertedinstructions"/>
-        <w:rPr>
-          <w:color w:val="000000"/>
-        </w:rPr>
-      </w:pPr>
-      <w:r>
-        <w:rPr>
-          <w:color w:val="000000"/>
-        </w:rPr>
-        <w:t>Your next friend will need to complete this step for you.</w:t>
-      </w:r>
-    </w:p>
-    <w:p>
-      <w:pPr>
-        <w:pStyle w:val="Normalforinsertedinstructions"/>
-        <w:rPr>
-          <w:color w:val="000000"/>
-        </w:rPr>
-      </w:pPr>
-      <w:r>
-        <w:rPr>
-          <w:color w:val="000000"/>
-        </w:rPr>
-        <w:t xml:space="preserve">{%p </w:t>
-      </w:r>
-      <w:proofErr w:type="gramStart"/>
-      <w:r>
-        <w:rPr>
-          <w:color w:val="000000"/>
-        </w:rPr>
-        <w:t>endif %}</w:t>
-      </w:r>
-      <w:proofErr w:type="gramEnd"/>
-    </w:p>
-    <w:p>
-      <w:pPr>
-        <w:pStyle w:val="Normalforinsertedinstructions"/>
-        <w:rPr>
-          <w:color w:val="000000"/>
-        </w:rPr>
-      </w:pPr>
-      <w:r>
-        <w:rPr>
-          <w:color w:val="000000"/>
-        </w:rPr>
-        <w:t>After the Respondent is served with the PPO papers, the server must complete the Proof of Service form that you got from the court.</w:t>
-      </w:r>
-    </w:p>
-    <w:p>
-      <w:pPr>
-        <w:pStyle w:val="Normalforinsertedinstructions"/>
-        <w:rPr>
-          <w:color w:val="000000"/>
-        </w:rPr>
-      </w:pPr>
-      <w:r>
-        <w:rPr>
-          <w:color w:val="000000"/>
-        </w:rPr>
-        <w:t>You may want to make copies of the completed Proof of Service form for your own records.</w:t>
-      </w:r>
-    </w:p>
-    <w:p>
-      <w:pPr>
-        <w:pStyle w:val="Normalforinsertedinstructions"/>
-        <w:rPr>
-          <w:color w:val="000000"/>
-        </w:rPr>
-      </w:pPr>
-      <w:r>
-        <w:rPr>
-          <w:color w:val="000000"/>
-        </w:rPr>
-        <w:t xml:space="preserve">File the Proof of Service form with the court through </w:t>
+        </w:rPr>
+        <w:t xml:space="preserve"> petition for a PPO:</w:t>
+      </w:r>
+    </w:p>
+    <w:p>
+      <w:pPr>
+        <w:pStyle w:val="Normalforinsertedinstructions"/>
+      </w:pPr>
+      <w:r>
+        <w:t xml:space="preserve">If you get a denial order and the court did not schedule your petition for a hearing, you can ask to schedule a hearing. You must do this within 21 days of the date the judge signed the denial order if you want a hearing. If you want to ask for a hearing, please send an email to the PPO Office at </w:t>
       </w:r>
       <w:hyperlink r:id="rId10" w:history="1">
+        <w:r>
+          <w:rPr>
+            <w:color w:val="0563C1"/>
+            <w:u w:val="single"/>
+          </w:rPr>
+          <w:t>ppo@oaklandcountymi.gov</w:t>
+        </w:r>
+      </w:hyperlink>
+      <w:r>
+        <w:t xml:space="preserve"> to ask for instructions and a form. This form must be completed and submitted through </w:t>
+      </w:r>
+      <w:hyperlink r:id="rId11" w:history="1">
         <w:proofErr w:type="spellStart"/>
         <w:r>
           <w:rPr>
@@ -1287,84 +805,74 @@
         <w:proofErr w:type="spellEnd"/>
       </w:hyperlink>
       <w:r>
-        <w:rPr>
-          <w:color w:val="000000"/>
-        </w:rPr>
-        <w:t xml:space="preserve">. If the Respondent was served by mail, the green card signed by the Respondent (the return receipt) must also be filed. Instructions for filing the Proof of Service can be found in the e-mail from the PPO Office that </w:t>
-      </w:r>
-      <w:proofErr w:type="gramStart"/>
-      <w:r>
-        <w:rPr>
-          <w:color w:val="000000"/>
-        </w:rPr>
-        <w:t>included</w:t>
-      </w:r>
-      <w:proofErr w:type="gramEnd"/>
-      <w:r>
-        <w:rPr>
-          <w:color w:val="000000"/>
-        </w:rPr>
-        <w:t xml:space="preserve"> the documents to be served.</w:t>
-      </w:r>
-    </w:p>
-    <w:p>
-      <w:pPr>
-        <w:pStyle w:val="Normalforinsertedinstructions"/>
-        <w:rPr>
-          <w:b/>
-          <w:color w:val="000000"/>
-        </w:rPr>
-      </w:pPr>
-      <w:r>
-        <w:rPr>
-          <w:b/>
-          <w:color w:val="000000"/>
-        </w:rPr>
-        <w:t xml:space="preserve">When Court Papers Can’t </w:t>
-      </w:r>
-      <w:proofErr w:type="gramStart"/>
-      <w:r>
-        <w:rPr>
-          <w:b/>
-          <w:color w:val="000000"/>
-        </w:rPr>
-        <w:t>be</w:t>
-      </w:r>
-      <w:proofErr w:type="gramEnd"/>
-      <w:r>
-        <w:rPr>
-          <w:b/>
-          <w:color w:val="000000"/>
-        </w:rPr>
-        <w:t xml:space="preserve"> Served.</w:t>
-      </w:r>
-    </w:p>
-    <w:p>
-      <w:pPr>
-        <w:pStyle w:val="Normalforinsertedinstructions"/>
-        <w:rPr>
-          <w:color w:val="000000"/>
-        </w:rPr>
-      </w:pPr>
-      <w:r>
-        <w:rPr>
-          <w:color w:val="000000"/>
-        </w:rPr>
-        <w:t xml:space="preserve">Sometimes court papers cannot be served because the address of the person to be served is wrong or the whereabouts of the person to be served are unknown. A hearing cannot be held until it can be proven </w:t>
-      </w:r>
-      <w:proofErr w:type="gramStart"/>
-      <w:r>
-        <w:rPr>
-          <w:color w:val="000000"/>
-        </w:rPr>
-        <w:t>to</w:t>
-      </w:r>
-      <w:proofErr w:type="gramEnd"/>
-      <w:r>
-        <w:rPr>
-          <w:color w:val="000000"/>
-        </w:rPr>
-        <w:t xml:space="preserve"> the court that both parties know about the hearing or that every effort was made to serve the court papers. If the other person's copy of the court papers is returned to you as undeliverable, you must contact the PPO Office at 248-303-1534 to discuss the possibility of alternate service. Alternate Service means the court may permit service in another manner that could reasonably give actual notice of the proceedings. Any request for alternate service must be made in a verified motion (FORM MC303).</w:t>
+        <w:t xml:space="preserve">. If a hearing is granted, you will find the Notice of Hearing in </w:t>
+      </w:r>
+      <w:proofErr w:type="spellStart"/>
+      <w:r>
+        <w:t>MiFile</w:t>
+      </w:r>
+      <w:proofErr w:type="spellEnd"/>
+      <w:r>
+        <w:t xml:space="preserve">. For questions about </w:t>
+      </w:r>
+      <w:proofErr w:type="spellStart"/>
+      <w:r>
+        <w:t>MiFile</w:t>
+      </w:r>
+      <w:proofErr w:type="spellEnd"/>
+      <w:r>
+        <w:t>, contact the Court Clerk’s Office at 248-858-0582.</w:t>
+      </w:r>
+    </w:p>
+    <w:p>
+      <w:pPr>
+        <w:pStyle w:val="Normalforinsertedinstructions"/>
+      </w:pPr>
+      <w:r>
+        <w:rPr>
+          <w:b/>
+          <w:bCs/>
+        </w:rPr>
+        <w:t xml:space="preserve">If you want to schedule your petition for a hearing </w:t>
+      </w:r>
+      <w:r>
+        <w:rPr>
+          <w:b/>
+          <w:bCs/>
+          <w:u w:val="single"/>
+        </w:rPr>
+        <w:t>instead of</w:t>
+      </w:r>
+      <w:r>
+        <w:rPr>
+          <w:b/>
+          <w:bCs/>
+        </w:rPr>
+        <w:t xml:space="preserve"> filing it as an ex </w:t>
+      </w:r>
+      <w:proofErr w:type="spellStart"/>
+      <w:r>
+        <w:rPr>
+          <w:b/>
+          <w:bCs/>
+        </w:rPr>
+        <w:t>parte</w:t>
+      </w:r>
+      <w:proofErr w:type="spellEnd"/>
+      <w:r>
+        <w:rPr>
+          <w:b/>
+          <w:bCs/>
+        </w:rPr>
+        <w:t xml:space="preserve"> petition:</w:t>
+      </w:r>
+    </w:p>
+    <w:p>
+      <w:pPr>
+        <w:pStyle w:val="Normalforinsertedinstructions"/>
+      </w:pPr>
+      <w:r>
+        <w:t>The court will schedule the hearing for you. The PPO Office will email you the completed Notice of Hearing and Zoom Hearing Instructions (if applicable).</w:t>
       </w:r>
     </w:p>
     <w:p>
@@ -1372,7 +880,280 @@
         <w:pStyle w:val="Heading3"/>
       </w:pPr>
       <w:r>
-        <w:t>Step 7: Attend the hearing</w:t>
+        <w:t xml:space="preserve">Step 5: Have the Respondent served </w:t>
+      </w:r>
+    </w:p>
+    <w:p>
+      <w:pPr>
+        <w:pStyle w:val="Normalforinsertedinstructions"/>
+        <w:rPr>
+          <w:color w:val="000000"/>
+        </w:rPr>
+      </w:pPr>
+      <w:r>
+        <w:rPr>
+          <w:color w:val="000000"/>
+        </w:rPr>
+        <w:t xml:space="preserve">Have the PPO documents served to the Respondent at least </w:t>
+      </w:r>
+      <w:r>
+        <w:rPr>
+          <w:color w:val="000000"/>
+        </w:rPr>
+        <w:t>one day [if domestic relationship or nondomestic stalking] two days [if nondomestic SA]</w:t>
+      </w:r>
+      <w:r>
+        <w:rPr>
+          <w:color w:val="000000"/>
+        </w:rPr>
+        <w:t xml:space="preserve"> before the hearing.</w:t>
+      </w:r>
+      <w:r>
+        <w:rPr>
+          <w:color w:val="000000"/>
+        </w:rPr>
+        <w:t xml:space="preserve"> </w:t>
+      </w:r>
+      <w:r>
+        <w:rPr>
+          <w:color w:val="000000"/>
+        </w:rPr>
+        <w:t>You can find instructions for service in the confirmation email that the PPO Office sent you after you submitted your petition to the court. The instructions are in the attachment called “Procedural Instructions for PPO."</w:t>
+      </w:r>
+    </w:p>
+    <w:p>
+      <w:pPr>
+        <w:pStyle w:val="Normalforinsertedinstructions"/>
+        <w:rPr>
+          <w:color w:val="000000"/>
+        </w:rPr>
+      </w:pPr>
+      <w:r>
+        <w:rPr>
+          <w:b/>
+          <w:bCs/>
+          <w:color w:val="000000"/>
+        </w:rPr>
+        <w:t xml:space="preserve">Gather what you need for </w:t>
+      </w:r>
+      <w:r>
+        <w:rPr>
+          <w:b/>
+          <w:bCs/>
+          <w:color w:val="000000"/>
+        </w:rPr>
+        <w:t>service</w:t>
+      </w:r>
+      <w:r>
+        <w:rPr>
+          <w:b/>
+          <w:bCs/>
+          <w:color w:val="000000"/>
+        </w:rPr>
+        <w:t>. You will need a copy of each of the following:</w:t>
+      </w:r>
+    </w:p>
+    <w:p>
+      <w:pPr>
+        <w:pStyle w:val="BulletedList"/>
+      </w:pPr>
+      <w:r>
+        <w:t>Petition for Personal Protection Order, including the Statement of Facts</w:t>
+      </w:r>
+    </w:p>
+    <w:p>
+      <w:pPr>
+        <w:pStyle w:val="BulletedList"/>
+      </w:pPr>
+      <w:r>
+        <w:t>Notice of Hearing on Petition for Personal Protection Order</w:t>
+      </w:r>
+    </w:p>
+    <w:p>
+      <w:pPr>
+        <w:pStyle w:val="BulletedList"/>
+      </w:pPr>
+      <w:r>
+        <w:t xml:space="preserve">Any attachments you filed with your petition (examples: police reports, medical records, </w:t>
+      </w:r>
+      <w:proofErr w:type="spellStart"/>
+      <w:r>
+        <w:t>etc</w:t>
+      </w:r>
+      <w:proofErr w:type="spellEnd"/>
+      <w:r>
+        <w:t xml:space="preserve"> that are related to your petition)</w:t>
+      </w:r>
+    </w:p>
+    <w:p>
+      <w:pPr>
+        <w:pStyle w:val="BulletedList"/>
+      </w:pPr>
+      <w:r>
+        <w:t>Zoom instructions from the court (if they sent you Zoom instructions)</w:t>
+      </w:r>
+    </w:p>
+    <w:p>
+      <w:pPr>
+        <w:pStyle w:val="Normalforinsertedinstructions"/>
+        <w:rPr>
+          <w:color w:val="000000"/>
+        </w:rPr>
+      </w:pPr>
+      <w:r>
+        <w:rPr>
+          <w:color w:val="000000"/>
+        </w:rPr>
+        <w:t xml:space="preserve">If you choose to, you may have the Oakland County Sheriff’s Office </w:t>
+      </w:r>
+      <w:r>
+        <w:rPr>
+          <w:color w:val="000000"/>
+        </w:rPr>
+        <w:t xml:space="preserve">Civil Unit </w:t>
+      </w:r>
+      <w:r>
+        <w:rPr>
+          <w:color w:val="000000"/>
+        </w:rPr>
+        <w:t xml:space="preserve">serve the Respondent. Contact information for the Oakland County Sheriff’s Office Civil </w:t>
+      </w:r>
+      <w:r>
+        <w:rPr>
+          <w:color w:val="000000"/>
+        </w:rPr>
+        <w:t xml:space="preserve">Unit </w:t>
+      </w:r>
+      <w:r>
+        <w:rPr>
+          <w:color w:val="000000"/>
+        </w:rPr>
+        <w:t>can be found in the “Procedural Instructions for PPO" document</w:t>
+      </w:r>
+      <w:r>
+        <w:rPr>
+          <w:color w:val="000000"/>
+        </w:rPr>
+        <w:t xml:space="preserve">. Contact the Oakland County Sheriff’s Office Civil Unit </w:t>
+      </w:r>
+      <w:r>
+        <w:rPr>
+          <w:b/>
+          <w:color w:val="FF0000"/>
+          <w:u w:val="single"/>
+        </w:rPr>
+        <w:t>BEFORE</w:t>
+      </w:r>
+      <w:r>
+        <w:rPr>
+          <w:color w:val="000000"/>
+        </w:rPr>
+        <w:t xml:space="preserve"> you make copies of the PPO documents to get additional instructions from them.</w:t>
+      </w:r>
+    </w:p>
+    <w:p>
+      <w:pPr>
+        <w:pStyle w:val="Normalforinsertedinstructions"/>
+        <w:rPr>
+          <w:b/>
+          <w:color w:val="000000"/>
+        </w:rPr>
+      </w:pPr>
+      <w:r>
+        <w:rPr>
+          <w:color w:val="000000"/>
+        </w:rPr>
+        <w:t xml:space="preserve">If you don’t want the Sheriff’s Office Civil Unit to serve for you, service can be completed by a professional process server, or an adult friend or relative. </w:t>
+      </w:r>
+      <w:r>
+        <w:t xml:space="preserve">{% if </w:t>
+      </w:r>
+      <w:proofErr w:type="spellStart"/>
+      <w:r>
+        <w:t>has_next_friend_petitioning</w:t>
+      </w:r>
+      <w:proofErr w:type="spellEnd"/>
+      <w:r>
+        <w:t xml:space="preserve"> %}</w:t>
+      </w:r>
+      <w:r>
+        <w:rPr>
+          <w:b/>
+          <w:bCs/>
+          <w:color w:val="000000"/>
+        </w:rPr>
+        <w:t>Neither you nor your next friend is allowed to serve the Respondent.</w:t>
+      </w:r>
+      <w:r>
+        <w:rPr>
+          <w:b/>
+          <w:bCs/>
+          <w:color w:val="000000"/>
+        </w:rPr>
+        <w:t xml:space="preserve"> </w:t>
+      </w:r>
+      <w:r>
+        <w:t>{%</w:t>
+      </w:r>
+      <w:r>
+        <w:t xml:space="preserve"> else</w:t>
+      </w:r>
+      <w:r>
+        <w:t xml:space="preserve"> %}</w:t>
+      </w:r>
+      <w:r>
+        <w:rPr>
+          <w:b/>
+          <w:color w:val="000000"/>
+        </w:rPr>
+        <w:t>You cannot serve the Respondent yourself.</w:t>
+      </w:r>
+      <w:r>
+        <w:t xml:space="preserve"> </w:t>
+      </w:r>
+      <w:r>
+        <w:t>{% endif %}</w:t>
+      </w:r>
+    </w:p>
+    <w:p>
+      <w:pPr>
+        <w:pStyle w:val="Normalforinsertedinstructions"/>
+        <w:rPr>
+          <w:color w:val="000000"/>
+        </w:rPr>
+      </w:pPr>
+      <w:r>
+        <w:rPr>
+          <w:color w:val="000000"/>
+        </w:rPr>
+        <w:t>You will need the Respondent's address and any other information that will help the process server find the Respondent.</w:t>
+      </w:r>
+    </w:p>
+    <w:p>
+      <w:pPr>
+        <w:pStyle w:val="Normalforinsertedinstructions"/>
+        <w:rPr>
+          <w:color w:val="000000"/>
+        </w:rPr>
+      </w:pPr>
+      <w:r>
+        <w:rPr>
+          <w:color w:val="000000"/>
+        </w:rPr>
+        <w:lastRenderedPageBreak/>
+        <w:t xml:space="preserve">The process server can give the Respondent the papers in person. Or the papers can be sent to the Respondent by registered mail with return receipt requested and delivery restricted to the Respondent. If the Respondent is served by mail, they must sign and return the green card (the return receipt). Even if the Respondent is served by mail, you need to find someone else to do the mailing. </w:t>
+      </w:r>
+      <w:r>
+        <w:rPr>
+          <w:color w:val="202124"/>
+        </w:rPr>
+        <w:t>The server’s address—not yours—should be the one on the r</w:t>
+      </w:r>
+      <w:r>
+        <w:rPr>
+          <w:color w:val="000000"/>
+        </w:rPr>
+        <w:t xml:space="preserve">eturn receipt. </w:t>
       </w:r>
     </w:p>
     <w:p>
@@ -1390,241 +1171,66 @@
       </w:r>
       <w:proofErr w:type="spellStart"/>
       <w:r>
-        <w:t>has_next_friend_</w:t>
-      </w:r>
-      <w:proofErr w:type="gramStart"/>
-      <w:r>
-        <w:t>petitioning</w:t>
+        <w:rPr>
+          <w:color w:val="000000"/>
+        </w:rPr>
+        <w:t>respondent_is_minor</w:t>
       </w:r>
       <w:proofErr w:type="spellEnd"/>
       <w:r>
         <w:rPr>
           <w:color w:val="000000"/>
         </w:rPr>
+        <w:t xml:space="preserve"> and not </w:t>
+      </w:r>
+      <w:proofErr w:type="spellStart"/>
+      <w:r>
+        <w:rPr>
+          <w:color w:val="000000"/>
+        </w:rPr>
+        <w:t>respondent_is_emancipated_minor</w:t>
+      </w:r>
+      <w:proofErr w:type="spellEnd"/>
+      <w:r>
+        <w:rPr>
+          <w:color w:val="000000"/>
+        </w:rPr>
         <w:t xml:space="preserve"> %}</w:t>
       </w:r>
-      <w:proofErr w:type="gramEnd"/>
-    </w:p>
-    <w:p>
-      <w:pPr>
-        <w:pStyle w:val="Normalforinsertedinstructions"/>
-        <w:rPr>
-          <w:color w:val="000000"/>
-        </w:rPr>
-      </w:pPr>
-      <w:r>
-        <w:rPr>
-          <w:color w:val="000000"/>
-        </w:rPr>
-        <w:t>Your next friend will need to attend the hearing with you and speak on your behalf.</w:t>
-      </w:r>
-    </w:p>
-    <w:p>
-      <w:pPr>
-        <w:pStyle w:val="Normalforinsertedinstructions"/>
-        <w:rPr>
-          <w:color w:val="000000"/>
-        </w:rPr>
-      </w:pPr>
-      <w:r>
-        <w:rPr>
-          <w:color w:val="000000"/>
-        </w:rPr>
-        <w:t xml:space="preserve">{%p </w:t>
-      </w:r>
-      <w:proofErr w:type="gramStart"/>
-      <w:r>
-        <w:rPr>
-          <w:color w:val="000000"/>
-        </w:rPr>
-        <w:t>endif %}</w:t>
-      </w:r>
-      <w:proofErr w:type="gramEnd"/>
-    </w:p>
-    <w:p>
-      <w:pPr>
-        <w:pStyle w:val="Normalforinsertedinstructions"/>
-        <w:rPr>
-          <w:color w:val="000000"/>
-        </w:rPr>
-      </w:pPr>
-      <w:r>
-        <w:rPr>
-          <w:color w:val="000000"/>
-        </w:rPr>
-        <w:t xml:space="preserve">These are brief instructions about attending your court hearing. For more detailed instructions about going to court, watch the </w:t>
-      </w:r>
-      <w:hyperlink r:id="rId11">
-        <w:r>
-          <w:rPr>
-            <w:color w:val="0563C1"/>
-            <w:u w:val="single"/>
-          </w:rPr>
-          <w:t>Going to Court</w:t>
-        </w:r>
-      </w:hyperlink>
-      <w:r>
-        <w:rPr>
-          <w:color w:val="000000"/>
-        </w:rPr>
-        <w:t xml:space="preserve"> video.</w:t>
-      </w:r>
-    </w:p>
-    <w:p>
-      <w:pPr>
-        <w:pStyle w:val="Normalforinsertedinstructions"/>
-        <w:rPr>
-          <w:color w:val="000000"/>
-        </w:rPr>
-      </w:pPr>
-      <w:r>
-        <w:rPr>
-          <w:color w:val="000000"/>
-        </w:rPr>
-        <w:t xml:space="preserve">Your court hearing might be in person at the courthouse or online through the Zoom platform. Below you will find information about both types of </w:t>
-      </w:r>
-      <w:proofErr w:type="gramStart"/>
-      <w:r>
-        <w:rPr>
-          <w:color w:val="000000"/>
-        </w:rPr>
-        <w:t>hearings</w:t>
-      </w:r>
-      <w:proofErr w:type="gramEnd"/>
-      <w:r>
-        <w:rPr>
-          <w:color w:val="000000"/>
-        </w:rPr>
-        <w:t>.</w:t>
-      </w:r>
-    </w:p>
-    <w:p>
-      <w:pPr>
-        <w:pStyle w:val="Heading4"/>
-      </w:pPr>
-      <w:r>
-        <w:t>Zoom hearing:</w:t>
-      </w:r>
-    </w:p>
-    <w:p>
-      <w:pPr>
-        <w:pStyle w:val="Normalforinsertedinstructions"/>
-      </w:pPr>
-      <w:r>
-        <w:t>Follow the instructions provided by the court to connect to your Zoom hearing. This is a court proceeding and appropriate conduct and attire is required.</w:t>
-      </w:r>
-    </w:p>
-    <w:p>
-      <w:pPr>
-        <w:pStyle w:val="BulletedList"/>
-      </w:pPr>
-      <w:r>
-        <w:t>All participants are required to appear on camera.</w:t>
-      </w:r>
-    </w:p>
-    <w:p>
-      <w:pPr>
-        <w:pStyle w:val="BulletedList"/>
-      </w:pPr>
-      <w:r>
-        <w:t>The Court may permit a party’s request to appear by audio only if the individual does not have the technological ability to appear on camera.</w:t>
-      </w:r>
-    </w:p>
-    <w:p>
-      <w:pPr>
-        <w:pStyle w:val="BulletedList"/>
-      </w:pPr>
-      <w:r>
-        <w:t>Remote participants must use a private, indoor, quiet room with adequate lighting that will be free of interruptions.</w:t>
-      </w:r>
-    </w:p>
-    <w:p>
-      <w:pPr>
-        <w:pStyle w:val="BulletedList"/>
-      </w:pPr>
-      <w:r>
-        <w:t>The Court retains its contempt powers to sanction individuals participating remotely.</w:t>
-      </w:r>
-    </w:p>
-    <w:p>
-      <w:pPr>
-        <w:pStyle w:val="Normalforinsertedinstructions"/>
-      </w:pPr>
-      <w:r>
-        <w:lastRenderedPageBreak/>
-        <w:t>Be prepared to answer questions from the judge about why you need a PPO. Answer the judge’s questions clearly and directly. The Respondent will also have a turn to speak.</w:t>
-      </w:r>
-    </w:p>
-    <w:p>
-      <w:pPr>
-        <w:pStyle w:val="Normalforinsertedinstructions"/>
-      </w:pPr>
-      <w:r>
-        <w:t>If the judge decides to grant you a PPO, the court will send you a copy of the order. You may want to make a copy for your employer, your child’s school or childcare provider, and several copies to keep in your home, car, etc. If the judge grants you a PPO, you will need to have the Respondent served with a copy of it (See Step 8).</w:t>
-      </w:r>
-    </w:p>
-    <w:p>
-      <w:pPr>
-        <w:pStyle w:val="Normalforinsertedinstructions"/>
-      </w:pPr>
-      <w:r>
-        <w:t>If the judge does not grant a PPO, the court will send you a copy of the denial order.</w:t>
-      </w:r>
-    </w:p>
-    <w:p>
-      <w:pPr>
-        <w:pStyle w:val="Heading4"/>
-      </w:pPr>
-      <w:r>
-        <w:t>Hearing at the courthouse:</w:t>
-      </w:r>
-    </w:p>
-    <w:p>
-      <w:pPr>
-        <w:pStyle w:val="Normalforinsertedinstructions"/>
-      </w:pPr>
-      <w:r>
-        <w:t>Go to the court on the scheduled day and time. Bring your proposed order to the hearing. Dress neatly. Arrive 10 or 15 minutes before your scheduled hearing time. Go to the clerk and tell them your name, that you are there for a hearing, and that you are representing yourself. Follow the clerk’s directions and do not interrupt any hearing in progress.</w:t>
-      </w:r>
-    </w:p>
-    <w:p>
-      <w:pPr>
-        <w:pStyle w:val="Normalforinsertedinstructions"/>
-      </w:pPr>
-      <w:r>
-        <w:t>Be prepared to answer questions from the judge about why you need a PPO.</w:t>
-      </w:r>
-    </w:p>
-    <w:p>
-      <w:pPr>
-        <w:pStyle w:val="Normalforinsertedinstructions"/>
-      </w:pPr>
-      <w:r>
-        <w:t>When you are called, go to the place you are directed and answer the judge’s questions clearly and directly. The Respondent will also have a turn to speak.</w:t>
-      </w:r>
-    </w:p>
-    <w:p>
-      <w:pPr>
-        <w:pStyle w:val="Normalforinsertedinstructions"/>
-      </w:pPr>
-      <w:r>
-        <w:t>If the judge decides to grant you a PPO, the judge will ask you for your order so they can fill it out and sign it. The court will give you and the Respondent a copy of the order. Ask the courtroom clerk for four (or more) copies of the order. You may want a copy for your employer, your child’s school or childcare provider, and several copies to keep in your home, car, etc.</w:t>
-      </w:r>
-    </w:p>
-    <w:p>
-      <w:pPr>
-        <w:pStyle w:val="Normalforinsertedinstructions"/>
-      </w:pPr>
-      <w:r>
-        <w:t>If the judge grants you a PPO, you will need to have the Respondent served with a copy of it (See Step 8).</w:t>
-      </w:r>
-    </w:p>
-    <w:p>
-      <w:pPr>
-        <w:pStyle w:val="Normalforinsertedinstructions"/>
-      </w:pPr>
-      <w:r>
-        <w:t>If the judge decides not to grant you a PPO, the court will give you an order denying a PPO.</w:t>
+    </w:p>
+    <w:p>
+      <w:pPr>
+        <w:pStyle w:val="Normalforinsertedinstructions"/>
+        <w:rPr>
+          <w:color w:val="000000"/>
+        </w:rPr>
+      </w:pPr>
+      <w:r>
+        <w:rPr>
+          <w:b/>
+          <w:color w:val="000000"/>
+        </w:rPr>
+        <w:t>If the Respondent is a minor</w:t>
+      </w:r>
+      <w:r>
+        <w:rPr>
+          <w:color w:val="000000"/>
+        </w:rPr>
+        <w:t xml:space="preserve">, you must also have copies of the forms served on the Respondent’s parent(s), guardian(s), or custodian(s), if you know their location. </w:t>
+      </w:r>
+    </w:p>
+    <w:p>
+      <w:pPr>
+        <w:pStyle w:val="Normalforinsertedinstructions"/>
+        <w:rPr>
+          <w:color w:val="000000"/>
+        </w:rPr>
+      </w:pPr>
+      <w:r>
+        <w:rPr>
+          <w:color w:val="000000"/>
+        </w:rPr>
+        <w:t>{%p endif %}</w:t>
       </w:r>
     </w:p>
     <w:p>
@@ -1632,330 +1238,33 @@
         <w:pStyle w:val="Heading3"/>
       </w:pPr>
       <w:r>
-        <w:t>Step 8: Have the Respondent served with the order</w:t>
-      </w:r>
-    </w:p>
-    <w:p>
-      <w:pPr>
-        <w:pStyle w:val="Normalforinsertedinstructions"/>
-      </w:pPr>
-      <w:proofErr w:type="gramStart"/>
-      <w:r>
-        <w:t>{%p if</w:t>
-      </w:r>
-      <w:proofErr w:type="gramEnd"/>
-      <w:r>
-        <w:t xml:space="preserve"> </w:t>
+        <w:t>Step 6: File the completed Proof of Service</w:t>
+      </w:r>
+    </w:p>
+    <w:p>
+      <w:pPr>
+        <w:pStyle w:val="Normalforinsertedinstructions"/>
+        <w:rPr>
+          <w:color w:val="000000"/>
+        </w:rPr>
+      </w:pPr>
+      <w:r>
+        <w:rPr>
+          <w:color w:val="000000"/>
+        </w:rPr>
+        <w:t xml:space="preserve">{%p if </w:t>
       </w:r>
       <w:proofErr w:type="spellStart"/>
       <w:r>
-        <w:t>respondent_is_minor</w:t>
+        <w:t>has_next_friend_petitioning</w:t>
       </w:r>
       <w:proofErr w:type="spellEnd"/>
       <w:r>
-        <w:t xml:space="preserve"> and not </w:t>
-      </w:r>
-      <w:proofErr w:type="spellStart"/>
-      <w:r>
-        <w:t>respondent_is_emancipated_</w:t>
-      </w:r>
-      <w:proofErr w:type="gramStart"/>
-      <w:r>
-        <w:t>minor</w:t>
-      </w:r>
-      <w:proofErr w:type="spellEnd"/>
-      <w:r>
+        <w:rPr>
+          <w:color w:val="000000"/>
+        </w:rPr>
         <w:t xml:space="preserve"> %}</w:t>
       </w:r>
-      <w:proofErr w:type="gramEnd"/>
-    </w:p>
-    <w:p>
-      <w:pPr>
-        <w:pStyle w:val="Normalforinsertedinstructions"/>
-        <w:rPr>
-          <w:b/>
-          <w:color w:val="000000"/>
-        </w:rPr>
-      </w:pPr>
-      <w:r>
-        <w:rPr>
-          <w:b/>
-          <w:color w:val="000000"/>
-        </w:rPr>
-        <w:t>If the respondent is a minor, also have a copy of the order served on the respondent’s parent(s), guardian(s), or custodian(s), if you know their location.</w:t>
-      </w:r>
-    </w:p>
-    <w:p>
-      <w:pPr>
-        <w:pStyle w:val="Normalforinsertedinstructions"/>
-      </w:pPr>
-      <w:r>
-        <w:t xml:space="preserve">{%p </w:t>
-      </w:r>
-      <w:proofErr w:type="gramStart"/>
-      <w:r>
-        <w:t>endif %}</w:t>
-      </w:r>
-      <w:proofErr w:type="gramEnd"/>
-    </w:p>
-    <w:p>
-      <w:pPr>
-        <w:pStyle w:val="Normalforinsertedinstructions"/>
-        <w:rPr>
-          <w:color w:val="000000"/>
-        </w:rPr>
-      </w:pPr>
-      <w:r>
-        <w:rPr>
-          <w:color w:val="000000"/>
-        </w:rPr>
-        <w:t>If the court granted you a Personal Protection Order and they did not give a copy to the Respondent at the hearing, you must arrange to have the Respondent served with a copy.</w:t>
-      </w:r>
-    </w:p>
-    <w:p>
-      <w:pPr>
-        <w:pStyle w:val="Normalforinsertedinstructions"/>
-        <w:rPr>
-          <w:b/>
-          <w:color w:val="000000"/>
-        </w:rPr>
-      </w:pPr>
-      <w:r>
-        <w:rPr>
-          <w:b/>
-          <w:color w:val="000000"/>
-        </w:rPr>
-        <w:t>Have the Personal Protection Order served (sent or given to) the Respondent.</w:t>
-      </w:r>
-      <w:r>
-        <w:rPr>
-          <w:color w:val="000000"/>
-        </w:rPr>
-        <w:t xml:space="preserve"> This can be done by a police officer, professional process server, or someone else who is 18 years or older. </w:t>
-      </w:r>
-      <w:r>
-        <w:t xml:space="preserve">{% if </w:t>
-      </w:r>
-      <w:proofErr w:type="spellStart"/>
-      <w:r>
-        <w:t>has_next_friend_petitioning</w:t>
-      </w:r>
-      <w:proofErr w:type="spellEnd"/>
-      <w:r>
-        <w:t xml:space="preserve"> </w:t>
-      </w:r>
-      <w:proofErr w:type="gramStart"/>
-      <w:r>
-        <w:t>%}</w:t>
-      </w:r>
-      <w:r>
-        <w:rPr>
-          <w:b/>
-          <w:bCs/>
-          <w:color w:val="000000"/>
-        </w:rPr>
-        <w:t>Neither</w:t>
-      </w:r>
-      <w:proofErr w:type="gramEnd"/>
-      <w:r>
-        <w:rPr>
-          <w:b/>
-          <w:bCs/>
-          <w:color w:val="000000"/>
-        </w:rPr>
-        <w:t xml:space="preserve"> you nor your next friend is allowed to serve the </w:t>
-      </w:r>
-      <w:proofErr w:type="gramStart"/>
-      <w:r>
-        <w:rPr>
-          <w:b/>
-          <w:bCs/>
-          <w:color w:val="000000"/>
-        </w:rPr>
-        <w:t>Respondent.</w:t>
-      </w:r>
-      <w:r>
-        <w:t>{</w:t>
-      </w:r>
-      <w:proofErr w:type="gramEnd"/>
-      <w:r>
-        <w:t>%</w:t>
-      </w:r>
-      <w:r>
-        <w:t xml:space="preserve"> else</w:t>
-      </w:r>
-      <w:r>
-        <w:t xml:space="preserve"> </w:t>
-      </w:r>
-      <w:proofErr w:type="gramStart"/>
-      <w:r>
-        <w:t>%}</w:t>
-      </w:r>
-      <w:r>
-        <w:rPr>
-          <w:b/>
-          <w:color w:val="000000"/>
-        </w:rPr>
-        <w:t>Do</w:t>
-      </w:r>
-      <w:proofErr w:type="gramEnd"/>
-      <w:r>
-        <w:rPr>
-          <w:b/>
-          <w:color w:val="000000"/>
-        </w:rPr>
-        <w:t xml:space="preserve"> not serve the Respondent </w:t>
-      </w:r>
-      <w:proofErr w:type="gramStart"/>
-      <w:r>
-        <w:rPr>
-          <w:b/>
-          <w:color w:val="000000"/>
-        </w:rPr>
-        <w:t>yourself.</w:t>
-      </w:r>
-      <w:r>
-        <w:t>{</w:t>
-      </w:r>
-      <w:proofErr w:type="gramEnd"/>
-      <w:r>
-        <w:t xml:space="preserve">% </w:t>
-      </w:r>
-      <w:proofErr w:type="gramStart"/>
-      <w:r>
-        <w:t>endif %}</w:t>
-      </w:r>
-      <w:proofErr w:type="gramEnd"/>
-    </w:p>
-    <w:p>
-      <w:pPr>
-        <w:pStyle w:val="Normalforinsertedinstructions"/>
-        <w:rPr>
-          <w:color w:val="000000"/>
-        </w:rPr>
-      </w:pPr>
-      <w:r>
-        <w:rPr>
-          <w:color w:val="000000"/>
-        </w:rPr>
-        <w:t>If you would like the Sheriff’s Office Civil Unit to serve the respondent for you, you may go to the Civil Unit Office after your hearing to arrange service. The Sheriff’s Office Civil Unit Office is on the 1st floor of the courthouse, north entrance hallway, second door on the right. Their telephone number is 248-452-9725.</w:t>
-      </w:r>
-    </w:p>
-    <w:p>
-      <w:pPr>
-        <w:pStyle w:val="Normalforinsertedinstructions"/>
-        <w:rPr>
-          <w:color w:val="000000"/>
-        </w:rPr>
-      </w:pPr>
-      <w:r>
-        <w:rPr>
-          <w:color w:val="000000"/>
-        </w:rPr>
-        <w:lastRenderedPageBreak/>
-        <w:t xml:space="preserve">The papers can also be served by registered mail with </w:t>
-      </w:r>
-      <w:proofErr w:type="gramStart"/>
-      <w:r>
-        <w:rPr>
-          <w:color w:val="000000"/>
-        </w:rPr>
-        <w:t>return</w:t>
-      </w:r>
-      <w:proofErr w:type="gramEnd"/>
-      <w:r>
-        <w:rPr>
-          <w:color w:val="000000"/>
-        </w:rPr>
-        <w:t xml:space="preserve"> receipt requested and delivery restricted to the Respondent. Even if the Respondent is served by mail, you need to find someone else to do the mailing. </w:t>
-      </w:r>
-      <w:r>
-        <w:rPr>
-          <w:color w:val="202124"/>
-        </w:rPr>
-        <w:t>The server’s address—not yours—should be the one on the return receipt.</w:t>
-      </w:r>
-      <w:r>
-        <w:rPr>
-          <w:color w:val="000000"/>
-        </w:rPr>
-        <w:t xml:space="preserve"> To learn more, read </w:t>
-      </w:r>
-      <w:hyperlink r:id="rId12">
-        <w:r>
-          <w:rPr>
-            <w:color w:val="0563C1"/>
-            <w:u w:val="single"/>
-          </w:rPr>
-          <w:t>Serving Your Personal Protection Order</w:t>
-        </w:r>
-      </w:hyperlink>
-      <w:r>
-        <w:rPr>
-          <w:color w:val="000000"/>
-        </w:rPr>
-        <w:t>.</w:t>
-      </w:r>
-    </w:p>
-    <w:p>
-      <w:pPr>
-        <w:pStyle w:val="Normalforinsertedinstructions"/>
-        <w:rPr>
-          <w:color w:val="000000"/>
-        </w:rPr>
-      </w:pPr>
-      <w:r>
-        <w:rPr>
-          <w:color w:val="000000"/>
-        </w:rPr>
-        <w:t>If the judge signed an order denying a PPO, the court will take care of serving the Respondent with the denial order.</w:t>
-      </w:r>
-    </w:p>
-    <w:p>
-      <w:pPr>
-        <w:pStyle w:val="Heading3"/>
-      </w:pPr>
-      <w:r>
-        <w:t xml:space="preserve">Step 9: File </w:t>
-      </w:r>
-      <w:proofErr w:type="gramStart"/>
-      <w:r>
-        <w:t>the completed</w:t>
-      </w:r>
-      <w:proofErr w:type="gramEnd"/>
-      <w:r>
-        <w:t xml:space="preserve"> Proof of Service</w:t>
-      </w:r>
-    </w:p>
-    <w:p>
-      <w:pPr>
-        <w:pStyle w:val="Normalforinsertedinstructions"/>
-        <w:rPr>
-          <w:color w:val="000000"/>
-        </w:rPr>
-      </w:pPr>
-      <w:r>
-        <w:rPr>
-          <w:color w:val="000000"/>
-        </w:rPr>
-        <w:t xml:space="preserve">{%p if </w:t>
-      </w:r>
-      <w:proofErr w:type="spellStart"/>
-      <w:r>
-        <w:t>has_next_friend_</w:t>
-      </w:r>
-      <w:proofErr w:type="gramStart"/>
-      <w:r>
-        <w:t>petitioning</w:t>
-      </w:r>
-      <w:proofErr w:type="spellEnd"/>
-      <w:r>
-        <w:rPr>
-          <w:color w:val="000000"/>
-        </w:rPr>
-        <w:t xml:space="preserve"> %}</w:t>
-      </w:r>
-      <w:proofErr w:type="gramEnd"/>
     </w:p>
     <w:p>
       <w:pPr>
@@ -1982,53 +1291,51 @@
         <w:rPr>
           <w:color w:val="000000"/>
         </w:rPr>
-        <w:t xml:space="preserve">{%p </w:t>
-      </w:r>
-      <w:proofErr w:type="gramStart"/>
-      <w:r>
-        <w:rPr>
-          <w:color w:val="000000"/>
-        </w:rPr>
-        <w:t>endif %}</w:t>
-      </w:r>
-      <w:proofErr w:type="gramEnd"/>
-    </w:p>
-    <w:p>
-      <w:pPr>
-        <w:pStyle w:val="Normalforinsertedinstructions"/>
-        <w:rPr>
-          <w:color w:val="000000"/>
-        </w:rPr>
-      </w:pPr>
-      <w:r>
-        <w:rPr>
-          <w:color w:val="000000"/>
-        </w:rPr>
-        <w:t>When you used the Do-It-Yourself Personal Protection Order (PPO) tool, you got a Proof of Service with the PPO.</w:t>
-      </w:r>
-    </w:p>
-    <w:p>
-      <w:pPr>
-        <w:pStyle w:val="Normalforinsertedinstructions"/>
-      </w:pPr>
-      <w:r>
-        <w:t xml:space="preserve">Have the server complete and sign the Proof of Service. This tells the court how and where the Respondent was served with the PPO. </w:t>
-      </w:r>
-    </w:p>
-    <w:p>
-      <w:pPr>
-        <w:pStyle w:val="Normalforinsertedinstructions"/>
-        <w:rPr>
-          <w:color w:val="000000"/>
-        </w:rPr>
-      </w:pPr>
-      <w:r>
-        <w:rPr>
-          <w:color w:val="222222"/>
-        </w:rPr>
-        <w:t xml:space="preserve">Make sure that you file the Proof of Service with the court through </w:t>
-      </w:r>
-      <w:hyperlink r:id="rId13" w:history="1">
+        <w:t>{%p endif %}</w:t>
+      </w:r>
+    </w:p>
+    <w:p>
+      <w:pPr>
+        <w:pStyle w:val="Normalforinsertedinstructions"/>
+        <w:rPr>
+          <w:color w:val="000000"/>
+        </w:rPr>
+      </w:pPr>
+      <w:r>
+        <w:rPr>
+          <w:color w:val="000000"/>
+        </w:rPr>
+        <w:t>After the Respondent is served with the PPO papers, the server must complete the Proof of Service form.</w:t>
+      </w:r>
+    </w:p>
+    <w:p>
+      <w:pPr>
+        <w:pStyle w:val="Normalforinsertedinstructions"/>
+        <w:rPr>
+          <w:color w:val="000000"/>
+        </w:rPr>
+      </w:pPr>
+      <w:r>
+        <w:rPr>
+          <w:color w:val="000000"/>
+        </w:rPr>
+        <w:t>You may want to make copies of the completed Proof of Service form for your own records.</w:t>
+      </w:r>
+    </w:p>
+    <w:p>
+      <w:pPr>
+        <w:pStyle w:val="Normalforinsertedinstructions"/>
+        <w:rPr>
+          <w:color w:val="000000"/>
+        </w:rPr>
+      </w:pPr>
+      <w:r>
+        <w:rPr>
+          <w:color w:val="000000"/>
+        </w:rPr>
+        <w:t xml:space="preserve">File the Proof of Service form with the court through </w:t>
+      </w:r>
+      <w:hyperlink r:id="rId12" w:history="1">
         <w:proofErr w:type="spellStart"/>
         <w:r>
           <w:rPr>
@@ -2043,6 +1350,592 @@
         <w:rPr>
           <w:color w:val="000000"/>
         </w:rPr>
+        <w:t xml:space="preserve">. If the Respondent was served by mail, the green card signed by the Respondent (the return receipt) must also be filed. </w:t>
+      </w:r>
+      <w:r>
+        <w:rPr>
+          <w:color w:val="000000"/>
+        </w:rPr>
+        <w:t>Instructions for filing the Proof of Service can be found in the confirmation email you got from the PPO Office after you filed. Look in the attachment called “Procedural Instructions for PPO.” </w:t>
+      </w:r>
+    </w:p>
+    <w:p>
+      <w:pPr>
+        <w:pStyle w:val="Normalforinsertedinstructions"/>
+        <w:rPr>
+          <w:b/>
+          <w:color w:val="000000"/>
+        </w:rPr>
+      </w:pPr>
+      <w:r>
+        <w:rPr>
+          <w:b/>
+          <w:color w:val="000000"/>
+        </w:rPr>
+        <w:t>When Court Papers Can’t be Served.</w:t>
+      </w:r>
+    </w:p>
+    <w:p>
+      <w:pPr>
+        <w:pStyle w:val="Normalforinsertedinstructions"/>
+        <w:rPr>
+          <w:color w:val="000000"/>
+        </w:rPr>
+      </w:pPr>
+      <w:r>
+        <w:rPr>
+          <w:color w:val="000000"/>
+        </w:rPr>
+        <w:t>Sometimes court papers cannot be served because the address of the person to be served is wrong or the whereabouts of the person to be served are unknown. A hearing cannot be held until it can be proven to the court that both parties know about the hearing or that every effort was made to serve the court papers. If the other person's copy of the court papers is returned to you as undeliverable, you must contact the PPO Office at 248-303-1534 to discuss the possibility of alternate service. Alternate Service means the court may permit service in another manner that could reasonably give actual notice of the proceedings. Any request for alternate service must be made in a verified motion (FORM MC303).</w:t>
+      </w:r>
+    </w:p>
+    <w:p>
+      <w:pPr>
+        <w:pStyle w:val="Heading3"/>
+      </w:pPr>
+      <w:r>
+        <w:t>Step 7: Attend the hearing</w:t>
+      </w:r>
+    </w:p>
+    <w:p>
+      <w:pPr>
+        <w:pStyle w:val="Normalforinsertedinstructions"/>
+        <w:rPr>
+          <w:color w:val="000000"/>
+        </w:rPr>
+      </w:pPr>
+      <w:r>
+        <w:rPr>
+          <w:color w:val="000000"/>
+        </w:rPr>
+        <w:t xml:space="preserve">{%p if </w:t>
+      </w:r>
+      <w:proofErr w:type="spellStart"/>
+      <w:r>
+        <w:t>has_next_friend_petitioning</w:t>
+      </w:r>
+      <w:proofErr w:type="spellEnd"/>
+      <w:r>
+        <w:rPr>
+          <w:color w:val="000000"/>
+        </w:rPr>
+        <w:t xml:space="preserve"> %}</w:t>
+      </w:r>
+    </w:p>
+    <w:p>
+      <w:pPr>
+        <w:pStyle w:val="Normalforinsertedinstructions"/>
+        <w:rPr>
+          <w:color w:val="000000"/>
+        </w:rPr>
+      </w:pPr>
+      <w:r>
+        <w:rPr>
+          <w:color w:val="000000"/>
+        </w:rPr>
+        <w:t>Your next friend will need to attend the hearing with you and speak on your behalf.</w:t>
+      </w:r>
+    </w:p>
+    <w:p>
+      <w:pPr>
+        <w:pStyle w:val="Normalforinsertedinstructions"/>
+        <w:rPr>
+          <w:color w:val="000000"/>
+        </w:rPr>
+      </w:pPr>
+      <w:r>
+        <w:rPr>
+          <w:color w:val="000000"/>
+        </w:rPr>
+        <w:t>{%p endif %}</w:t>
+      </w:r>
+    </w:p>
+    <w:p>
+      <w:pPr>
+        <w:pStyle w:val="Normalforinsertedinstructions"/>
+        <w:rPr>
+          <w:color w:val="000000"/>
+        </w:rPr>
+      </w:pPr>
+      <w:r>
+        <w:rPr>
+          <w:color w:val="000000"/>
+        </w:rPr>
+        <w:t xml:space="preserve">These are brief instructions about attending your court hearing. For more detailed instructions about going to court, watch the </w:t>
+      </w:r>
+      <w:hyperlink r:id="rId13">
+        <w:r>
+          <w:rPr>
+            <w:color w:val="0563C1"/>
+            <w:u w:val="single"/>
+          </w:rPr>
+          <w:t>Going to Court</w:t>
+        </w:r>
+      </w:hyperlink>
+      <w:r>
+        <w:rPr>
+          <w:color w:val="000000"/>
+        </w:rPr>
+        <w:t xml:space="preserve"> video.</w:t>
+      </w:r>
+    </w:p>
+    <w:p>
+      <w:pPr>
+        <w:pStyle w:val="Normalforinsertedinstructions"/>
+        <w:rPr>
+          <w:color w:val="000000"/>
+        </w:rPr>
+      </w:pPr>
+      <w:r>
+        <w:rPr>
+          <w:color w:val="000000"/>
+        </w:rPr>
+        <w:t>Your court hearing might be in person at the courthouse or online through the Zoom platform. Below you will find information about both types of hearings.</w:t>
+      </w:r>
+    </w:p>
+    <w:p>
+      <w:pPr>
+        <w:pStyle w:val="Heading4"/>
+      </w:pPr>
+      <w:r>
+        <w:lastRenderedPageBreak/>
+        <w:t>Zoom hearing:</w:t>
+      </w:r>
+    </w:p>
+    <w:p>
+      <w:pPr>
+        <w:pStyle w:val="Normalforinsertedinstructions"/>
+      </w:pPr>
+      <w:r>
+        <w:t>Follow the instructions provided by the court to connect to your Zoom hearing. This is a court proceeding and appropriate conduct and attire is required.</w:t>
+      </w:r>
+    </w:p>
+    <w:p>
+      <w:pPr>
+        <w:pStyle w:val="BulletedList"/>
+      </w:pPr>
+      <w:r>
+        <w:t>All participants are required to appear on camera.</w:t>
+      </w:r>
+    </w:p>
+    <w:p>
+      <w:pPr>
+        <w:pStyle w:val="BulletedList"/>
+      </w:pPr>
+      <w:r>
+        <w:t>The Court may permit a party’s request to appear by audio only if the individual does not have the technological ability to appear on camera.</w:t>
+      </w:r>
+    </w:p>
+    <w:p>
+      <w:pPr>
+        <w:pStyle w:val="BulletedList"/>
+      </w:pPr>
+      <w:r>
+        <w:t>Remote participants must use a private, indoor, quiet room with adequate lighting that will be free of interruptions.</w:t>
+      </w:r>
+    </w:p>
+    <w:p>
+      <w:pPr>
+        <w:pStyle w:val="BulletedList"/>
+      </w:pPr>
+      <w:r>
+        <w:t>The Court retains its contempt powers to sanction individuals participating remotely.</w:t>
+      </w:r>
+    </w:p>
+    <w:p>
+      <w:pPr>
+        <w:pStyle w:val="Normalforinsertedinstructions"/>
+      </w:pPr>
+      <w:r>
+        <w:t>Be prepared to answer questions from the judge about why you need a PPO. Answer the judge’s questions clearly and directly. The Respondent will also have a turn to speak.</w:t>
+      </w:r>
+    </w:p>
+    <w:p>
+      <w:pPr>
+        <w:pStyle w:val="Normalforinsertedinstructions"/>
+      </w:pPr>
+      <w:r>
+        <w:t>If the judge decides to grant you a PPO, the court will send you a copy of the order. You may want to make a copy for your employer, your child’s school or childcare provider, and several copies to keep in your home, car, etc. If the judge grants you a PPO, you will need to have the Respondent served with a copy of it (See Step 8).</w:t>
+      </w:r>
+    </w:p>
+    <w:p>
+      <w:pPr>
+        <w:pStyle w:val="Normalforinsertedinstructions"/>
+      </w:pPr>
+      <w:r>
+        <w:t>If the judge does not grant a PPO, the court will send you a copy of the denial order.</w:t>
+      </w:r>
+    </w:p>
+    <w:p>
+      <w:pPr>
+        <w:pStyle w:val="Heading4"/>
+      </w:pPr>
+      <w:r>
+        <w:t>Hearing at the courthouse:</w:t>
+      </w:r>
+    </w:p>
+    <w:p>
+      <w:pPr>
+        <w:pStyle w:val="Normalforinsertedinstructions"/>
+      </w:pPr>
+      <w:r>
+        <w:t>Go to the court on the scheduled day and time. Bring your proposed order to the hearing. Dress neatly. Arrive 10 or 15 minutes before your scheduled hearing time. Go to the clerk and tell them your name, that you are there for a hearing, and that you are representing yourself. Follow the clerk’s directions and do not interrupt any hearing in progress.</w:t>
+      </w:r>
+    </w:p>
+    <w:p>
+      <w:pPr>
+        <w:pStyle w:val="Normalforinsertedinstructions"/>
+      </w:pPr>
+      <w:r>
+        <w:t>Be prepared to answer questions from the judge about why you need a PPO.</w:t>
+      </w:r>
+    </w:p>
+    <w:p>
+      <w:pPr>
+        <w:pStyle w:val="Normalforinsertedinstructions"/>
+      </w:pPr>
+      <w:r>
+        <w:t>When you are called, go to the place you are directed and answer the judge’s questions clearly and directly. The Respondent will also have a turn to speak.</w:t>
+      </w:r>
+    </w:p>
+    <w:p>
+      <w:pPr>
+        <w:pStyle w:val="Normalforinsertedinstructions"/>
+      </w:pPr>
+      <w:r>
+        <w:t>If the judge decides to grant you a PPO, the judge will ask you for your order so they can fill it out and sign it. The court will give you and the Respondent a copy of the order. Ask the courtroom clerk for four (or more) copies of the order. You may want a copy for your employer, your child’s school or childcare provider, and several copies to keep in your home, car, etc.</w:t>
+      </w:r>
+    </w:p>
+    <w:p>
+      <w:pPr>
+        <w:pStyle w:val="Normalforinsertedinstructions"/>
+      </w:pPr>
+      <w:r>
+        <w:t>If the judge grants you a PPO, you will need to have the Respondent served with a copy of it (See Step 8).</w:t>
+      </w:r>
+    </w:p>
+    <w:p>
+      <w:pPr>
+        <w:pStyle w:val="Normalforinsertedinstructions"/>
+      </w:pPr>
+      <w:r>
+        <w:t>If the judge decides not to grant you a PPO, the court will give you an order denying a PPO.</w:t>
+      </w:r>
+    </w:p>
+    <w:p>
+      <w:pPr>
+        <w:pStyle w:val="Heading3"/>
+      </w:pPr>
+      <w:r>
+        <w:t>Step 8: Have the Respondent served with the order</w:t>
+      </w:r>
+    </w:p>
+    <w:p>
+      <w:pPr>
+        <w:pStyle w:val="Normalforinsertedinstructions"/>
+      </w:pPr>
+      <w:r>
+        <w:t>{%p if</w:t>
+      </w:r>
+      <w:r>
+        <w:t xml:space="preserve"> </w:t>
+      </w:r>
+      <w:proofErr w:type="spellStart"/>
+      <w:r>
+        <w:t>respondent_is_minor</w:t>
+      </w:r>
+      <w:proofErr w:type="spellEnd"/>
+      <w:r>
+        <w:t xml:space="preserve"> and not </w:t>
+      </w:r>
+      <w:proofErr w:type="spellStart"/>
+      <w:r>
+        <w:t>respondent_is_emancipated_minor</w:t>
+      </w:r>
+      <w:proofErr w:type="spellEnd"/>
+      <w:r>
+        <w:t xml:space="preserve"> %}</w:t>
+      </w:r>
+    </w:p>
+    <w:p>
+      <w:pPr>
+        <w:pStyle w:val="Normalforinsertedinstructions"/>
+        <w:rPr>
+          <w:b/>
+          <w:color w:val="000000"/>
+        </w:rPr>
+      </w:pPr>
+      <w:r>
+        <w:rPr>
+          <w:b/>
+          <w:color w:val="000000"/>
+        </w:rPr>
+        <w:t>If the respondent is a minor, also have a copy of the order served on the respondent’s parent(s), guardian(s), or custodian(s), if you know their location.</w:t>
+      </w:r>
+    </w:p>
+    <w:p>
+      <w:pPr>
+        <w:pStyle w:val="Normalforinsertedinstructions"/>
+      </w:pPr>
+      <w:r>
+        <w:t>{%p endif %}</w:t>
+      </w:r>
+    </w:p>
+    <w:p>
+      <w:pPr>
+        <w:pStyle w:val="Normalforinsertedinstructions"/>
+        <w:rPr>
+          <w:color w:val="000000"/>
+        </w:rPr>
+      </w:pPr>
+      <w:r>
+        <w:rPr>
+          <w:color w:val="000000"/>
+        </w:rPr>
+        <w:lastRenderedPageBreak/>
+        <w:t>If the court granted you a Personal Protection Order and they did not give a copy to the Respondent at the hearing, you must arrange to have the Respondent served with a copy.</w:t>
+      </w:r>
+    </w:p>
+    <w:p>
+      <w:pPr>
+        <w:pStyle w:val="Normalforinsertedinstructions"/>
+        <w:rPr>
+          <w:b/>
+          <w:color w:val="000000"/>
+        </w:rPr>
+      </w:pPr>
+      <w:r>
+        <w:rPr>
+          <w:b/>
+          <w:color w:val="000000"/>
+        </w:rPr>
+        <w:t>Have the Personal Protection Order served (sent or given to) the Respondent.</w:t>
+      </w:r>
+      <w:r>
+        <w:rPr>
+          <w:color w:val="000000"/>
+        </w:rPr>
+        <w:t xml:space="preserve"> This can be done by a police officer, professional process server, or someone else who is 18 years or older. </w:t>
+      </w:r>
+      <w:r>
+        <w:t xml:space="preserve">{% if </w:t>
+      </w:r>
+      <w:proofErr w:type="spellStart"/>
+      <w:r>
+        <w:t>has_next_friend_petitioning</w:t>
+      </w:r>
+      <w:proofErr w:type="spellEnd"/>
+      <w:r>
+        <w:t xml:space="preserve"> %}</w:t>
+      </w:r>
+      <w:r>
+        <w:rPr>
+          <w:b/>
+          <w:bCs/>
+          <w:color w:val="000000"/>
+        </w:rPr>
+        <w:t>Neither you nor your next friend is allowed to serve the Respondent.</w:t>
+      </w:r>
+      <w:r>
+        <w:t>{%</w:t>
+      </w:r>
+      <w:r>
+        <w:t xml:space="preserve"> else</w:t>
+      </w:r>
+      <w:r>
+        <w:t xml:space="preserve"> %}</w:t>
+      </w:r>
+      <w:r>
+        <w:rPr>
+          <w:b/>
+          <w:color w:val="000000"/>
+        </w:rPr>
+        <w:t>Do not serve the Respondent yourself.</w:t>
+      </w:r>
+      <w:r>
+        <w:t>{% endif %}</w:t>
+      </w:r>
+    </w:p>
+    <w:p>
+      <w:pPr>
+        <w:pStyle w:val="Normalforinsertedinstructions"/>
+        <w:rPr>
+          <w:color w:val="000000"/>
+        </w:rPr>
+      </w:pPr>
+      <w:r>
+        <w:rPr>
+          <w:color w:val="000000"/>
+        </w:rPr>
+        <w:t>If you would like the Sheriff’s Office Civil Unit to serve the respondent for you, you may go to the Civil Unit Office after your hearing to arrange service. The Sheriff’s Office Civil Unit Office is on the 1st floor of the courthouse, north entrance hallway, second door on the right. Their telephone number is 248-452-9725.</w:t>
+      </w:r>
+    </w:p>
+    <w:p>
+      <w:pPr>
+        <w:pStyle w:val="Normalforinsertedinstructions"/>
+        <w:rPr>
+          <w:color w:val="000000"/>
+        </w:rPr>
+      </w:pPr>
+      <w:r>
+        <w:rPr>
+          <w:color w:val="000000"/>
+        </w:rPr>
+        <w:t xml:space="preserve">The papers can also be served by registered mail with return receipt requested and delivery restricted to the Respondent. Even if the Respondent is served by mail, you need to find someone else to do the mailing. </w:t>
+      </w:r>
+      <w:r>
+        <w:rPr>
+          <w:color w:val="202124"/>
+        </w:rPr>
+        <w:t>The server’s address—not yours—should be the one on the return receipt.</w:t>
+      </w:r>
+      <w:r>
+        <w:rPr>
+          <w:color w:val="000000"/>
+        </w:rPr>
+        <w:t xml:space="preserve"> To learn more, read </w:t>
+      </w:r>
+      <w:hyperlink r:id="rId14">
+        <w:r>
+          <w:rPr>
+            <w:color w:val="0563C1"/>
+            <w:u w:val="single"/>
+          </w:rPr>
+          <w:t>Serving Your Personal Protection Order</w:t>
+        </w:r>
+      </w:hyperlink>
+      <w:r>
+        <w:rPr>
+          <w:color w:val="000000"/>
+        </w:rPr>
+        <w:t>.</w:t>
+      </w:r>
+    </w:p>
+    <w:p>
+      <w:pPr>
+        <w:pStyle w:val="Normalforinsertedinstructions"/>
+        <w:rPr>
+          <w:color w:val="000000"/>
+        </w:rPr>
+      </w:pPr>
+      <w:r>
+        <w:rPr>
+          <w:color w:val="000000"/>
+        </w:rPr>
+        <w:t>If the judge signed an order denying a PPO, the court will take care of serving the Respondent with the denial order.</w:t>
+      </w:r>
+    </w:p>
+    <w:p>
+      <w:pPr>
+        <w:pStyle w:val="Heading3"/>
+      </w:pPr>
+      <w:r>
+        <w:t>Step 9: File the completed Proof of Service</w:t>
+      </w:r>
+    </w:p>
+    <w:p>
+      <w:pPr>
+        <w:pStyle w:val="Normalforinsertedinstructions"/>
+        <w:rPr>
+          <w:color w:val="000000"/>
+        </w:rPr>
+      </w:pPr>
+      <w:r>
+        <w:rPr>
+          <w:color w:val="000000"/>
+        </w:rPr>
+        <w:t xml:space="preserve">{%p if </w:t>
+      </w:r>
+      <w:proofErr w:type="spellStart"/>
+      <w:r>
+        <w:t>has_next_friend_petitioning</w:t>
+      </w:r>
+      <w:proofErr w:type="spellEnd"/>
+      <w:r>
+        <w:rPr>
+          <w:color w:val="000000"/>
+        </w:rPr>
+        <w:t xml:space="preserve"> %}</w:t>
+      </w:r>
+    </w:p>
+    <w:p>
+      <w:pPr>
+        <w:pStyle w:val="Normalforinsertedinstructions"/>
+        <w:rPr>
+          <w:color w:val="000000"/>
+        </w:rPr>
+      </w:pPr>
+      <w:r>
+        <w:rPr>
+          <w:color w:val="000000"/>
+        </w:rPr>
+        <w:t>Your next friend will need to complete this step for you.</w:t>
+      </w:r>
+    </w:p>
+    <w:p>
+      <w:pPr>
+        <w:pStyle w:val="Normalforinsertedinstructions"/>
+        <w:rPr>
+          <w:color w:val="000000"/>
+        </w:rPr>
+      </w:pPr>
+      <w:r>
+        <w:rPr>
+          <w:color w:val="000000"/>
+        </w:rPr>
+        <w:t>{%p endif %}</w:t>
+      </w:r>
+    </w:p>
+    <w:p>
+      <w:pPr>
+        <w:pStyle w:val="Normalforinsertedinstructions"/>
+        <w:rPr>
+          <w:color w:val="000000"/>
+        </w:rPr>
+      </w:pPr>
+      <w:r>
+        <w:rPr>
+          <w:color w:val="000000"/>
+        </w:rPr>
+        <w:t>When you used the Do-It-Yourself Personal Protection Order (PPO) tool, you got a Proof of Service with the PPO.</w:t>
+      </w:r>
+    </w:p>
+    <w:p>
+      <w:pPr>
+        <w:pStyle w:val="Normalforinsertedinstructions"/>
+      </w:pPr>
+      <w:r>
+        <w:t xml:space="preserve">Have the server complete and sign the Proof of Service. This tells the court how and where the Respondent was served with the PPO. </w:t>
+      </w:r>
+    </w:p>
+    <w:p>
+      <w:pPr>
+        <w:pStyle w:val="Normalforinsertedinstructions"/>
+        <w:rPr>
+          <w:color w:val="000000"/>
+        </w:rPr>
+      </w:pPr>
+      <w:r>
+        <w:rPr>
+          <w:color w:val="222222"/>
+        </w:rPr>
+        <w:t xml:space="preserve">Make sure that you file the Proof of Service with the court through </w:t>
+      </w:r>
+      <w:hyperlink r:id="rId15" w:history="1">
+        <w:proofErr w:type="spellStart"/>
+        <w:r>
+          <w:rPr>
+            <w:color w:val="0563C1"/>
+            <w:u w:val="single"/>
+          </w:rPr>
+          <w:t>MiFILE</w:t>
+        </w:r>
+        <w:proofErr w:type="spellEnd"/>
+      </w:hyperlink>
+      <w:r>
+        <w:rPr>
+          <w:color w:val="000000"/>
+        </w:rPr>
         <w:t xml:space="preserve">. </w:t>
       </w:r>
       <w:r>
@@ -2065,7 +1958,7 @@
         </w:rPr>
         <w:t xml:space="preserve"> instructions can be found on the </w:t>
       </w:r>
-      <w:hyperlink r:id="rId14">
+      <w:hyperlink r:id="rId16">
         <w:r>
           <w:rPr>
             <w:color w:val="0563C1"/>
@@ -2086,15 +1979,7 @@
         <w:pStyle w:val="Normalforinsertedinstructions"/>
       </w:pPr>
       <w:r>
-        <w:t xml:space="preserve">After you have your PPO, you can enforce it by calling the police if the Respondent ever violates it. It is a good idea to </w:t>
-      </w:r>
-      <w:proofErr w:type="gramStart"/>
-      <w:r>
-        <w:t>keep a copy of your PPO and Proof of Service with you at all times</w:t>
-      </w:r>
-      <w:proofErr w:type="gramEnd"/>
-      <w:r>
-        <w:t xml:space="preserve"> because it will make enforcement easier if it becomes necessary.</w:t>
+        <w:t>After you have your PPO, you can enforce it by calling the police if the Respondent ever violates it. It is a good idea to keep a copy of your PPO and Proof of Service with you at all times because it will make enforcement easier if it becomes necessary.</w:t>
       </w:r>
     </w:p>
     <w:p>
@@ -2110,7 +1995,7 @@
         </w:rPr>
         <w:t xml:space="preserve">If the Respondent violates the PPO and they are not arrested, also call the PPO Office or e-mail them at </w:t>
       </w:r>
-      <w:hyperlink r:id="rId15">
+      <w:hyperlink r:id="rId17">
         <w:r>
           <w:rPr>
             <w:color w:val="0563C1"/>
@@ -2123,21 +2008,7 @@
         <w:rPr>
           <w:color w:val="000000"/>
         </w:rPr>
-        <w:t xml:space="preserve"> for instructions on how to report the violation to the court. Even if you filed a police report, the police </w:t>
-      </w:r>
-      <w:proofErr w:type="gramStart"/>
-      <w:r>
-        <w:rPr>
-          <w:color w:val="000000"/>
-        </w:rPr>
-        <w:t>will</w:t>
-      </w:r>
-      <w:proofErr w:type="gramEnd"/>
-      <w:r>
-        <w:rPr>
-          <w:color w:val="000000"/>
-        </w:rPr>
-        <w:t xml:space="preserve"> not report the violation to the court. If you want the court to know about the violation, you must report the violation to the court.</w:t>
+        <w:t xml:space="preserve"> for instructions on how to report the violation to the court. Even if you filed a police report, the police will not report the violation to the court. If you want the court to know about the violation, you must report the violation to the court.</w:t>
       </w:r>
     </w:p>
     <w:sectPr>
@@ -2607,6 +2478,155 @@
     </w:lvl>
   </w:abstractNum>
   <w:abstractNum w:abstractNumId="4" w15:restartNumberingAfterBreak="0">
+    <w:nsid w:val="76805626"/>
+    <w:multiLevelType w:val="multilevel"/>
+    <w:tmpl w:val="5FCA621A"/>
+    <w:lvl w:ilvl="0">
+      <w:start w:val="1"/>
+      <w:numFmt w:val="bullet"/>
+      <w:lvlText w:val=""/>
+      <w:lvlJc w:val="left"/>
+      <w:pPr>
+        <w:tabs>
+          <w:tab w:val="num" w:pos="720"/>
+        </w:tabs>
+        <w:ind w:left="720" w:hanging="360"/>
+      </w:pPr>
+      <w:rPr>
+        <w:rFonts w:ascii="Symbol" w:hAnsi="Symbol" w:hint="default"/>
+        <w:sz w:val="20"/>
+      </w:rPr>
+    </w:lvl>
+    <w:lvl w:ilvl="1" w:tentative="1">
+      <w:start w:val="1"/>
+      <w:numFmt w:val="bullet"/>
+      <w:lvlText w:val="o"/>
+      <w:lvlJc w:val="left"/>
+      <w:pPr>
+        <w:tabs>
+          <w:tab w:val="num" w:pos="1440"/>
+        </w:tabs>
+        <w:ind w:left="1440" w:hanging="360"/>
+      </w:pPr>
+      <w:rPr>
+        <w:rFonts w:ascii="Courier New" w:hAnsi="Courier New" w:hint="default"/>
+        <w:sz w:val="20"/>
+      </w:rPr>
+    </w:lvl>
+    <w:lvl w:ilvl="2" w:tentative="1">
+      <w:start w:val="1"/>
+      <w:numFmt w:val="bullet"/>
+      <w:lvlText w:val=""/>
+      <w:lvlJc w:val="left"/>
+      <w:pPr>
+        <w:tabs>
+          <w:tab w:val="num" w:pos="2160"/>
+        </w:tabs>
+        <w:ind w:left="2160" w:hanging="360"/>
+      </w:pPr>
+      <w:rPr>
+        <w:rFonts w:ascii="Wingdings" w:hAnsi="Wingdings" w:hint="default"/>
+        <w:sz w:val="20"/>
+      </w:rPr>
+    </w:lvl>
+    <w:lvl w:ilvl="3" w:tentative="1">
+      <w:start w:val="1"/>
+      <w:numFmt w:val="bullet"/>
+      <w:lvlText w:val=""/>
+      <w:lvlJc w:val="left"/>
+      <w:pPr>
+        <w:tabs>
+          <w:tab w:val="num" w:pos="2880"/>
+        </w:tabs>
+        <w:ind w:left="2880" w:hanging="360"/>
+      </w:pPr>
+      <w:rPr>
+        <w:rFonts w:ascii="Wingdings" w:hAnsi="Wingdings" w:hint="default"/>
+        <w:sz w:val="20"/>
+      </w:rPr>
+    </w:lvl>
+    <w:lvl w:ilvl="4" w:tentative="1">
+      <w:start w:val="1"/>
+      <w:numFmt w:val="bullet"/>
+      <w:lvlText w:val=""/>
+      <w:lvlJc w:val="left"/>
+      <w:pPr>
+        <w:tabs>
+          <w:tab w:val="num" w:pos="3600"/>
+        </w:tabs>
+        <w:ind w:left="3600" w:hanging="360"/>
+      </w:pPr>
+      <w:rPr>
+        <w:rFonts w:ascii="Wingdings" w:hAnsi="Wingdings" w:hint="default"/>
+        <w:sz w:val="20"/>
+      </w:rPr>
+    </w:lvl>
+    <w:lvl w:ilvl="5" w:tentative="1">
+      <w:start w:val="1"/>
+      <w:numFmt w:val="bullet"/>
+      <w:lvlText w:val=""/>
+      <w:lvlJc w:val="left"/>
+      <w:pPr>
+        <w:tabs>
+          <w:tab w:val="num" w:pos="4320"/>
+        </w:tabs>
+        <w:ind w:left="4320" w:hanging="360"/>
+      </w:pPr>
+      <w:rPr>
+        <w:rFonts w:ascii="Wingdings" w:hAnsi="Wingdings" w:hint="default"/>
+        <w:sz w:val="20"/>
+      </w:rPr>
+    </w:lvl>
+    <w:lvl w:ilvl="6" w:tentative="1">
+      <w:start w:val="1"/>
+      <w:numFmt w:val="bullet"/>
+      <w:lvlText w:val=""/>
+      <w:lvlJc w:val="left"/>
+      <w:pPr>
+        <w:tabs>
+          <w:tab w:val="num" w:pos="5040"/>
+        </w:tabs>
+        <w:ind w:left="5040" w:hanging="360"/>
+      </w:pPr>
+      <w:rPr>
+        <w:rFonts w:ascii="Wingdings" w:hAnsi="Wingdings" w:hint="default"/>
+        <w:sz w:val="20"/>
+      </w:rPr>
+    </w:lvl>
+    <w:lvl w:ilvl="7" w:tentative="1">
+      <w:start w:val="1"/>
+      <w:numFmt w:val="bullet"/>
+      <w:lvlText w:val=""/>
+      <w:lvlJc w:val="left"/>
+      <w:pPr>
+        <w:tabs>
+          <w:tab w:val="num" w:pos="5760"/>
+        </w:tabs>
+        <w:ind w:left="5760" w:hanging="360"/>
+      </w:pPr>
+      <w:rPr>
+        <w:rFonts w:ascii="Wingdings" w:hAnsi="Wingdings" w:hint="default"/>
+        <w:sz w:val="20"/>
+      </w:rPr>
+    </w:lvl>
+    <w:lvl w:ilvl="8" w:tentative="1">
+      <w:start w:val="1"/>
+      <w:numFmt w:val="bullet"/>
+      <w:lvlText w:val=""/>
+      <w:lvlJc w:val="left"/>
+      <w:pPr>
+        <w:tabs>
+          <w:tab w:val="num" w:pos="6480"/>
+        </w:tabs>
+        <w:ind w:left="6480" w:hanging="360"/>
+      </w:pPr>
+      <w:rPr>
+        <w:rFonts w:ascii="Wingdings" w:hAnsi="Wingdings" w:hint="default"/>
+        <w:sz w:val="20"/>
+      </w:rPr>
+    </w:lvl>
+  </w:abstractNum>
+  <w:abstractNum w:abstractNumId="5" w15:restartNumberingAfterBreak="0">
     <w:nsid w:val="79627113"/>
     <w:multiLevelType w:val="multilevel"/>
     <w:tmpl w:val="670CB82A"/>
@@ -2727,13 +2747,16 @@
     <w:abstractNumId w:val="3"/>
   </w:num>
   <w:num w:numId="3" w16cid:durableId="308945251">
-    <w:abstractNumId w:val="4"/>
+    <w:abstractNumId w:val="5"/>
   </w:num>
   <w:num w:numId="4" w16cid:durableId="1048917367">
     <w:abstractNumId w:val="1"/>
   </w:num>
   <w:num w:numId="5" w16cid:durableId="240061563">
     <w:abstractNumId w:val="0"/>
+  </w:num>
+  <w:num w:numId="6" w16cid:durableId="1995446447">
+    <w:abstractNumId w:val="4"/>
   </w:num>
 </w:numbering>
 </file>
@@ -3403,6 +3426,17 @@
     <w:qFormat/>
     <w:rsid w:val="00722FB9"/>
   </w:style>
+  <w:style w:type="character" w:styleId="Hyperlink">
+    <w:name w:val="Hyperlink"/>
+    <w:basedOn w:val="DefaultParagraphFont"/>
+    <w:uiPriority w:val="99"/>
+    <w:unhideWhenUsed/>
+    <w:rsid w:val="00F07F03"/>
+    <w:rPr>
+      <w:color w:val="0000FF" w:themeColor="hyperlink"/>
+      <w:u w:val="single"/>
+    </w:rPr>
+  </w:style>
 </w:styles>
 </file>
 

</xml_diff>

<commit_message>
fix typo in ex parte and email address in after hearing instructions
</commit_message>
<xml_diff>
--- a/docassemble/MLHPPOAndProposedOrder/data/templates/oakland_county_instructions_after_hearing.docx
+++ b/docassemble/MLHPPOAndProposedOrder/data/templates/oakland_county_instructions_after_hearing.docx
@@ -1995,13 +1995,13 @@
         </w:rPr>
         <w:t xml:space="preserve">If the Respondent violates the PPO and they are not arrested, also call the PPO Office or e-mail them at </w:t>
       </w:r>
-      <w:hyperlink r:id="rId17">
+      <w:hyperlink r:id="rId17" w:history="1">
         <w:r>
           <w:rPr>
             <w:color w:val="0563C1"/>
             <w:u w:val="single"/>
           </w:rPr>
-          <w:t>PPO@oakgov.com</w:t>
+          <w:t>ppo@oaklandcountymi.gov</w:t>
         </w:r>
       </w:hyperlink>
       <w:r>

</xml_diff>

<commit_message>
Revert "Oakland county instruction and button code update"
</commit_message>
<xml_diff>
--- a/docassemble/MLHPPOAndProposedOrder/data/templates/oakland_county_instructions_after_hearing.docx
+++ b/docassemble/MLHPPOAndProposedOrder/data/templates/oakland_county_instructions_after_hearing.docx
@@ -9,16 +9,29 @@
       <w:r>
         <w:t>Oakland County Instructions - How to Ask for a Personal Protection Order (</w:t>
       </w:r>
+      <w:proofErr w:type="gramStart"/>
       <w:r>
         <w:t xml:space="preserve">{{ </w:t>
       </w:r>
       <w:proofErr w:type="spellStart"/>
       <w:r>
-        <w:t>ppo_type_full</w:t>
+        <w:t>ppo</w:t>
+      </w:r>
+      <w:proofErr w:type="gramEnd"/>
+      <w:r>
+        <w:t>_type_</w:t>
+      </w:r>
+      <w:proofErr w:type="gramStart"/>
+      <w:r>
+        <w:t>full</w:t>
       </w:r>
       <w:proofErr w:type="spellEnd"/>
       <w:r>
-        <w:t xml:space="preserve"> }}</w:t>
+        <w:t xml:space="preserve"> }</w:t>
+      </w:r>
+      <w:proofErr w:type="gramEnd"/>
+      <w:r>
+        <w:t>}</w:t>
       </w:r>
       <w:r>
         <w:t>) with a Hearing</w:t>
@@ -28,19 +41,37 @@
       <w:pPr>
         <w:pStyle w:val="Normalforinsertedinstructions"/>
       </w:pPr>
-      <w:r>
-        <w:t>Following are step-by-step instructions to help you file a Petition for a Personal Protection Order (</w:t>
-      </w:r>
+      <w:proofErr w:type="gramStart"/>
+      <w:r>
+        <w:t>Following</w:t>
+      </w:r>
+      <w:proofErr w:type="gramEnd"/>
+      <w:r>
+        <w:t xml:space="preserve"> are step-by-step instructions to help you file a Petition for a Personal Protection Order (</w:t>
+      </w:r>
+      <w:proofErr w:type="gramStart"/>
       <w:r>
         <w:t xml:space="preserve">{{ </w:t>
       </w:r>
       <w:proofErr w:type="spellStart"/>
       <w:r>
-        <w:t>ppo_type_full</w:t>
+        <w:t>ppo</w:t>
+      </w:r>
+      <w:proofErr w:type="gramEnd"/>
+      <w:r>
+        <w:t>_type_</w:t>
+      </w:r>
+      <w:proofErr w:type="gramStart"/>
+      <w:r>
+        <w:t>full</w:t>
       </w:r>
       <w:proofErr w:type="spellEnd"/>
       <w:r>
-        <w:t xml:space="preserve"> }}</w:t>
+        <w:t xml:space="preserve"> }</w:t>
+      </w:r>
+      <w:proofErr w:type="gramEnd"/>
+      <w:r>
+        <w:t>}</w:t>
       </w:r>
       <w:r>
         <w:t xml:space="preserve">) </w:t>
@@ -439,7 +470,15 @@
         <w:pStyle w:val="BulletedList"/>
       </w:pPr>
       <w:r>
-        <w:t>Exhibits to Personal Protection Order (if you uploaded any documents)</w:t>
+        <w:t xml:space="preserve">Exhibits to Personal Protection Order (if you </w:t>
+      </w:r>
+      <w:proofErr w:type="gramStart"/>
+      <w:r>
+        <w:t>uploaded</w:t>
+      </w:r>
+      <w:proofErr w:type="gramEnd"/>
+      <w:r>
+        <w:t xml:space="preserve"> any documents)</w:t>
       </w:r>
     </w:p>
     <w:p>
@@ -476,12 +515,17 @@
       </w:r>
       <w:proofErr w:type="spellStart"/>
       <w:r>
-        <w:t>has_next_friend_petitioning</w:t>
+        <w:t>has_next_friend_</w:t>
+      </w:r>
+      <w:proofErr w:type="gramStart"/>
+      <w:r>
+        <w:t>petitioning</w:t>
       </w:r>
       <w:proofErr w:type="spellEnd"/>
       <w:r>
         <w:t xml:space="preserve"> %}</w:t>
       </w:r>
+      <w:proofErr w:type="gramEnd"/>
     </w:p>
     <w:p>
       <w:pPr>
@@ -496,8 +540,13 @@
         <w:pStyle w:val="Normalforinsertedinstructions"/>
       </w:pPr>
       <w:r>
-        <w:t>{%p endif %}</w:t>
-      </w:r>
+        <w:t xml:space="preserve">{%p </w:t>
+      </w:r>
+      <w:proofErr w:type="gramStart"/>
+      <w:r>
+        <w:t>endif %}</w:t>
+      </w:r>
+      <w:proofErr w:type="gramEnd"/>
     </w:p>
     <w:p>
       <w:pPr>
@@ -582,12 +631,17 @@
       </w:r>
       <w:proofErr w:type="spellStart"/>
       <w:r>
-        <w:t>has_next_friend_petitioning</w:t>
+        <w:t>has_next_friend_</w:t>
+      </w:r>
+      <w:proofErr w:type="gramStart"/>
+      <w:r>
+        <w:t>petitioning</w:t>
       </w:r>
       <w:proofErr w:type="spellEnd"/>
       <w:r>
         <w:t xml:space="preserve"> %}</w:t>
       </w:r>
+      <w:proofErr w:type="gramEnd"/>
     </w:p>
     <w:p>
       <w:pPr>
@@ -602,8 +656,13 @@
         <w:pStyle w:val="Normalforinsertedinstructions"/>
       </w:pPr>
       <w:r>
-        <w:t>{%p endif %}</w:t>
-      </w:r>
+        <w:t xml:space="preserve">{%p </w:t>
+      </w:r>
+      <w:proofErr w:type="gramStart"/>
+      <w:r>
+        <w:t>endif %}</w:t>
+      </w:r>
+      <w:proofErr w:type="gramEnd"/>
     </w:p>
     <w:p>
       <w:pPr>
@@ -643,11 +702,35 @@
       </w:r>
       <w:proofErr w:type="spellStart"/>
       <w:r>
-        <w:t>is_incapacitated_adult</w:t>
+        <w:t>is_incapacitated_</w:t>
+      </w:r>
+      <w:proofErr w:type="gramStart"/>
+      <w:r>
+        <w:t>adult</w:t>
       </w:r>
       <w:proofErr w:type="spellEnd"/>
       <w:r>
-        <w:t xml:space="preserve"> %} Make sure you upload the Order Regarding Appointment of Guardian or the power of attorney paperwork.{% endif %} </w:t>
+        <w:t xml:space="preserve"> %}</w:t>
+      </w:r>
+      <w:proofErr w:type="gramEnd"/>
+      <w:r>
+        <w:t xml:space="preserve"> Make sure you upload the Order Regarding Appointment of Guardian or the power of attorney </w:t>
+      </w:r>
+      <w:proofErr w:type="gramStart"/>
+      <w:r>
+        <w:t>paperwork.{</w:t>
+      </w:r>
+      <w:proofErr w:type="gramEnd"/>
+      <w:r>
+        <w:t xml:space="preserve">% </w:t>
+      </w:r>
+      <w:proofErr w:type="gramStart"/>
+      <w:r>
+        <w:t>endif %}</w:t>
+      </w:r>
+      <w:proofErr w:type="gramEnd"/>
+      <w:r>
+        <w:t xml:space="preserve"> </w:t>
       </w:r>
     </w:p>
     <w:p>
@@ -744,56 +827,455 @@
         <w:pStyle w:val="Normalforinsertedinstructions"/>
       </w:pPr>
       <w:r>
+        <w:t>Make a copy of each of the following completed forms:</w:t>
+      </w:r>
+    </w:p>
+    <w:p>
+      <w:pPr>
+        <w:pStyle w:val="BulletedList"/>
+      </w:pPr>
+      <w:r>
+        <w:t>Petition for Personal Protection Order (including the Statement of Facts and any attachments, such as police reports and medical records related to your petition)</w:t>
+      </w:r>
+    </w:p>
+    <w:p>
+      <w:pPr>
+        <w:pStyle w:val="BulletedList"/>
+      </w:pPr>
+      <w:r>
+        <w:t>Notice of Hearing and Zoom Hearing Instructions (if applicable)</w:t>
+      </w:r>
+    </w:p>
+    <w:p>
+      <w:pPr>
+        <w:pStyle w:val="Normalforinsertedinstructions"/>
+      </w:pPr>
+      <w:r>
+        <w:t>The copies will be served (given or sent to) the Respondent.</w:t>
+      </w:r>
+    </w:p>
+    <w:p>
+      <w:pPr>
+        <w:pStyle w:val="Normalforinsertedinstructions"/>
+      </w:pPr>
+      <w:r>
+        <w:t xml:space="preserve">If you are going to arrange to have the Oakland County Sheriff’s Office Civil Unit serve the Respondent with the papers, contact the Civil Unit </w:t>
+      </w:r>
+      <w:r>
+        <w:rPr>
+          <w:b/>
+        </w:rPr>
+        <w:t>before</w:t>
+      </w:r>
+      <w:r>
+        <w:t xml:space="preserve"> you make copies of the PPO documents to get instructions from them. Read Step 5 to learn more about this.</w:t>
+      </w:r>
+    </w:p>
+    <w:p>
+      <w:pPr>
+        <w:pStyle w:val="Heading3"/>
+      </w:pPr>
+      <w:r>
+        <w:t xml:space="preserve">Step 5: Have the Respondent served </w:t>
+      </w:r>
+    </w:p>
+    <w:p>
+      <w:pPr>
+        <w:pStyle w:val="Normalforinsertedinstructions"/>
+        <w:rPr>
+          <w:color w:val="000000"/>
+        </w:rPr>
+      </w:pPr>
+      <w:r>
+        <w:rPr>
+          <w:color w:val="000000"/>
+        </w:rPr>
+        <w:t>Have the PPO documents served to the Respondent at least five days before the hearing.</w:t>
+      </w:r>
+    </w:p>
+    <w:p>
+      <w:pPr>
+        <w:pStyle w:val="Normalforinsertedinstructions"/>
+        <w:rPr>
+          <w:color w:val="000000"/>
+        </w:rPr>
+      </w:pPr>
+      <w:r>
+        <w:rPr>
+          <w:color w:val="000000"/>
+        </w:rPr>
+        <w:t xml:space="preserve">If you choose to, you may have the Oakland County Sheriff’s Office serve the Respondent. Contact information for the Oakland County Sheriff’s Office Civil Unit will be provided in the same PPO document email from the PPO Office. Contact the Oakland County Sheriff’s Office Civil Unit </w:t>
+      </w:r>
+      <w:r>
+        <w:rPr>
+          <w:b/>
+          <w:color w:val="FF0000"/>
+          <w:u w:val="single"/>
+        </w:rPr>
+        <w:t>BEFORE</w:t>
+      </w:r>
+      <w:r>
+        <w:rPr>
+          <w:color w:val="000000"/>
+        </w:rPr>
+        <w:t xml:space="preserve"> you make copies of the PPO documents to get additional instructions from them.</w:t>
+      </w:r>
+    </w:p>
+    <w:p>
+      <w:pPr>
+        <w:pStyle w:val="Normalforinsertedinstructions"/>
+        <w:rPr>
+          <w:b/>
+          <w:color w:val="000000"/>
+        </w:rPr>
+      </w:pPr>
+      <w:r>
+        <w:rPr>
+          <w:color w:val="000000"/>
+        </w:rPr>
+        <w:t xml:space="preserve">If you don’t want the Sheriff’s Office Civil Unit to serve for you, service can be completed by a professional process server, or an adult friend or relative. </w:t>
+      </w:r>
+      <w:r>
+        <w:t xml:space="preserve">{% if </w:t>
+      </w:r>
+      <w:proofErr w:type="spellStart"/>
+      <w:r>
+        <w:t>has_next_friend_petitioning</w:t>
+      </w:r>
+      <w:proofErr w:type="spellEnd"/>
+      <w:r>
+        <w:t xml:space="preserve"> </w:t>
+      </w:r>
+      <w:proofErr w:type="gramStart"/>
+      <w:r>
+        <w:t>%}</w:t>
+      </w:r>
+      <w:r>
         <w:rPr>
           <w:b/>
           <w:bCs/>
-        </w:rPr>
-        <w:t xml:space="preserve">If you want a hearing after the judge denied your </w:t>
-      </w:r>
+          <w:color w:val="000000"/>
+        </w:rPr>
+        <w:t>Neither</w:t>
+      </w:r>
+      <w:proofErr w:type="gramEnd"/>
       <w:r>
         <w:rPr>
           <w:b/>
           <w:bCs/>
-        </w:rPr>
-        <w:t xml:space="preserve">ex </w:t>
-      </w:r>
-      <w:proofErr w:type="spellStart"/>
+          <w:color w:val="000000"/>
+        </w:rPr>
+        <w:t xml:space="preserve"> you nor your next friend is allowed to serve the Respondent.</w:t>
+      </w:r>
       <w:r>
         <w:rPr>
           <w:b/>
           <w:bCs/>
-        </w:rPr>
-        <w:t>parte</w:t>
+          <w:color w:val="000000"/>
+        </w:rPr>
+        <w:t xml:space="preserve"> </w:t>
+      </w:r>
+      <w:r>
+        <w:t>{%</w:t>
+      </w:r>
+      <w:r>
+        <w:t xml:space="preserve"> else</w:t>
+      </w:r>
+      <w:r>
+        <w:t xml:space="preserve"> </w:t>
+      </w:r>
+      <w:proofErr w:type="gramStart"/>
+      <w:r>
+        <w:t>%}</w:t>
+      </w:r>
+      <w:r>
+        <w:rPr>
+          <w:b/>
+          <w:color w:val="000000"/>
+        </w:rPr>
+        <w:t>You</w:t>
+      </w:r>
+      <w:proofErr w:type="gramEnd"/>
+      <w:r>
+        <w:rPr>
+          <w:b/>
+          <w:color w:val="000000"/>
+        </w:rPr>
+        <w:t xml:space="preserve"> cannot serve the Respondent yourself.</w:t>
+      </w:r>
+      <w:r>
+        <w:t xml:space="preserve"> </w:t>
+      </w:r>
+      <w:r>
+        <w:t>{% endif %}</w:t>
+      </w:r>
+    </w:p>
+    <w:p>
+      <w:pPr>
+        <w:pStyle w:val="Normalforinsertedinstructions"/>
+        <w:rPr>
+          <w:color w:val="000000"/>
+        </w:rPr>
+      </w:pPr>
+      <w:r>
+        <w:rPr>
+          <w:color w:val="000000"/>
+        </w:rPr>
+        <w:t>You will need the Respondent's address and any other information that will help the process server find the Respondent.</w:t>
+      </w:r>
+    </w:p>
+    <w:p>
+      <w:pPr>
+        <w:pStyle w:val="Normalforinsertedinstructions"/>
+        <w:rPr>
+          <w:color w:val="000000"/>
+        </w:rPr>
+      </w:pPr>
+      <w:r>
+        <w:rPr>
+          <w:color w:val="000000"/>
+        </w:rPr>
+        <w:t xml:space="preserve">The process server can give the Respondent the papers in person. Or the papers can be sent to the Respondent by registered mail with return receipt requested and delivery restricted to the Respondent. If the Respondent is served by mail, they must sign and return the green card (the return receipt). Even if the Respondent is served by mail, you need to find someone else to do the mailing. </w:t>
+      </w:r>
+      <w:r>
+        <w:rPr>
+          <w:color w:val="202124"/>
+        </w:rPr>
+        <w:t>The server’s address—not yours—should be the one on the r</w:t>
+      </w:r>
+      <w:r>
+        <w:rPr>
+          <w:color w:val="000000"/>
+        </w:rPr>
+        <w:t xml:space="preserve">eturn receipt. </w:t>
+      </w:r>
+    </w:p>
+    <w:p>
+      <w:pPr>
+        <w:pStyle w:val="Normalforinsertedinstructions"/>
+        <w:rPr>
+          <w:color w:val="000000"/>
+        </w:rPr>
+      </w:pPr>
+      <w:proofErr w:type="gramStart"/>
+      <w:r>
+        <w:rPr>
+          <w:color w:val="000000"/>
+        </w:rPr>
+        <w:t>{%p if</w:t>
+      </w:r>
+      <w:proofErr w:type="gramEnd"/>
+      <w:r>
+        <w:rPr>
+          <w:color w:val="000000"/>
+        </w:rPr>
+        <w:t xml:space="preserve"> </w:t>
+      </w:r>
+      <w:proofErr w:type="spellStart"/>
+      <w:r>
+        <w:rPr>
+          <w:color w:val="000000"/>
+        </w:rPr>
+        <w:t>respondent_is_minor</w:t>
       </w:r>
       <w:proofErr w:type="spellEnd"/>
       <w:r>
         <w:rPr>
+          <w:color w:val="000000"/>
+        </w:rPr>
+        <w:t xml:space="preserve"> and not </w:t>
+      </w:r>
+      <w:proofErr w:type="spellStart"/>
+      <w:r>
+        <w:rPr>
+          <w:color w:val="000000"/>
+        </w:rPr>
+        <w:t>respondent_is_emancipated_</w:t>
+      </w:r>
+      <w:proofErr w:type="gramStart"/>
+      <w:r>
+        <w:rPr>
+          <w:color w:val="000000"/>
+        </w:rPr>
+        <w:t>minor</w:t>
+      </w:r>
+      <w:proofErr w:type="spellEnd"/>
+      <w:r>
+        <w:rPr>
+          <w:color w:val="000000"/>
+        </w:rPr>
+        <w:t xml:space="preserve"> %}</w:t>
+      </w:r>
+      <w:proofErr w:type="gramEnd"/>
+    </w:p>
+    <w:p>
+      <w:pPr>
+        <w:pStyle w:val="Normalforinsertedinstructions"/>
+        <w:rPr>
+          <w:color w:val="000000"/>
+        </w:rPr>
+      </w:pPr>
+      <w:r>
+        <w:rPr>
           <w:b/>
-          <w:bCs/>
-        </w:rPr>
-        <w:t xml:space="preserve"> petition for a PPO:</w:t>
-      </w:r>
-    </w:p>
-    <w:p>
-      <w:pPr>
-        <w:pStyle w:val="Normalforinsertedinstructions"/>
-      </w:pPr>
-      <w:r>
-        <w:t xml:space="preserve">If you get a denial order and the court did not schedule your petition for a hearing, you can ask to schedule a hearing. You must do this within 21 days of the date the judge signed the denial order if you want a hearing. If you want to ask for a hearing, please send an email to the PPO Office at </w:t>
+          <w:color w:val="000000"/>
+        </w:rPr>
+        <w:t>If the Respondent is a minor</w:t>
+      </w:r>
+      <w:r>
+        <w:rPr>
+          <w:color w:val="000000"/>
+        </w:rPr>
+        <w:t xml:space="preserve">, you must also have copies of the forms served on the Respondent’s parent(s), guardian(s), or custodian(s), if you know their location. </w:t>
+      </w:r>
+    </w:p>
+    <w:p>
+      <w:pPr>
+        <w:pStyle w:val="Normalforinsertedinstructions"/>
+        <w:rPr>
+          <w:color w:val="000000"/>
+        </w:rPr>
+      </w:pPr>
+      <w:r>
+        <w:rPr>
+          <w:color w:val="000000"/>
+        </w:rPr>
+        <w:t xml:space="preserve">{%p </w:t>
+      </w:r>
+      <w:proofErr w:type="gramStart"/>
+      <w:r>
+        <w:rPr>
+          <w:color w:val="000000"/>
+        </w:rPr>
+        <w:t>endif %}</w:t>
+      </w:r>
+      <w:proofErr w:type="gramEnd"/>
+    </w:p>
+    <w:p>
+      <w:pPr>
+        <w:pStyle w:val="Heading3"/>
+      </w:pPr>
+      <w:r>
+        <w:lastRenderedPageBreak/>
+        <w:t xml:space="preserve">Step 6: File </w:t>
+      </w:r>
+      <w:proofErr w:type="gramStart"/>
+      <w:r>
+        <w:t>the completed</w:t>
+      </w:r>
+      <w:proofErr w:type="gramEnd"/>
+      <w:r>
+        <w:t xml:space="preserve"> Proof of Service</w:t>
+      </w:r>
+    </w:p>
+    <w:p>
+      <w:pPr>
+        <w:pStyle w:val="Normalforinsertedinstructions"/>
+        <w:rPr>
+          <w:color w:val="000000"/>
+        </w:rPr>
+      </w:pPr>
+      <w:r>
+        <w:rPr>
+          <w:color w:val="000000"/>
+        </w:rPr>
+        <w:t xml:space="preserve">{%p if </w:t>
+      </w:r>
+      <w:proofErr w:type="spellStart"/>
+      <w:r>
+        <w:t>has_next_friend_</w:t>
+      </w:r>
+      <w:proofErr w:type="gramStart"/>
+      <w:r>
+        <w:t>petitioning</w:t>
+      </w:r>
+      <w:proofErr w:type="spellEnd"/>
+      <w:r>
+        <w:rPr>
+          <w:color w:val="000000"/>
+        </w:rPr>
+        <w:t xml:space="preserve"> %}</w:t>
+      </w:r>
+      <w:proofErr w:type="gramEnd"/>
+    </w:p>
+    <w:p>
+      <w:pPr>
+        <w:pStyle w:val="Normalforinsertedinstructions"/>
+        <w:rPr>
+          <w:color w:val="000000"/>
+        </w:rPr>
+      </w:pPr>
+      <w:r>
+        <w:rPr>
+          <w:color w:val="000000"/>
+        </w:rPr>
+        <w:t>Your next friend will need to complete this step for you.</w:t>
+      </w:r>
+    </w:p>
+    <w:p>
+      <w:pPr>
+        <w:pStyle w:val="Normalforinsertedinstructions"/>
+        <w:rPr>
+          <w:color w:val="000000"/>
+        </w:rPr>
+      </w:pPr>
+      <w:r>
+        <w:rPr>
+          <w:color w:val="000000"/>
+        </w:rPr>
+        <w:t xml:space="preserve">{%p </w:t>
+      </w:r>
+      <w:proofErr w:type="gramStart"/>
+      <w:r>
+        <w:rPr>
+          <w:color w:val="000000"/>
+        </w:rPr>
+        <w:t>endif %}</w:t>
+      </w:r>
+      <w:proofErr w:type="gramEnd"/>
+    </w:p>
+    <w:p>
+      <w:pPr>
+        <w:pStyle w:val="Normalforinsertedinstructions"/>
+        <w:rPr>
+          <w:color w:val="000000"/>
+        </w:rPr>
+      </w:pPr>
+      <w:r>
+        <w:rPr>
+          <w:color w:val="000000"/>
+        </w:rPr>
+        <w:t>After the Respondent is served with the PPO papers, the server must complete the Proof of Service form that you got from the court.</w:t>
+      </w:r>
+    </w:p>
+    <w:p>
+      <w:pPr>
+        <w:pStyle w:val="Normalforinsertedinstructions"/>
+        <w:rPr>
+          <w:color w:val="000000"/>
+        </w:rPr>
+      </w:pPr>
+      <w:r>
+        <w:rPr>
+          <w:color w:val="000000"/>
+        </w:rPr>
+        <w:t>You may want to make copies of the completed Proof of Service form for your own records.</w:t>
+      </w:r>
+    </w:p>
+    <w:p>
+      <w:pPr>
+        <w:pStyle w:val="Normalforinsertedinstructions"/>
+        <w:rPr>
+          <w:color w:val="000000"/>
+        </w:rPr>
+      </w:pPr>
+      <w:r>
+        <w:rPr>
+          <w:color w:val="000000"/>
+        </w:rPr>
+        <w:t xml:space="preserve">File the Proof of Service form with the court through </w:t>
       </w:r>
       <w:hyperlink r:id="rId10" w:history="1">
-        <w:r>
-          <w:rPr>
-            <w:color w:val="0563C1"/>
-            <w:u w:val="single"/>
-          </w:rPr>
-          <w:t>ppo@oaklandcountymi.gov</w:t>
-        </w:r>
-      </w:hyperlink>
-      <w:r>
-        <w:t xml:space="preserve"> to ask for instructions and a form. This form must be completed and submitted through </w:t>
-      </w:r>
-      <w:hyperlink r:id="rId11" w:history="1">
         <w:proofErr w:type="spellStart"/>
         <w:r>
           <w:rPr>
@@ -805,466 +1287,675 @@
         <w:proofErr w:type="spellEnd"/>
       </w:hyperlink>
       <w:r>
-        <w:t xml:space="preserve">. If a hearing is granted, you will find the Notice of Hearing in </w:t>
+        <w:rPr>
+          <w:color w:val="000000"/>
+        </w:rPr>
+        <w:t xml:space="preserve">. If the Respondent was served by mail, the green card signed by the Respondent (the return receipt) must also be filed. Instructions for filing the Proof of Service can be found in the e-mail from the PPO Office that </w:t>
+      </w:r>
+      <w:proofErr w:type="gramStart"/>
+      <w:r>
+        <w:rPr>
+          <w:color w:val="000000"/>
+        </w:rPr>
+        <w:t>included</w:t>
+      </w:r>
+      <w:proofErr w:type="gramEnd"/>
+      <w:r>
+        <w:rPr>
+          <w:color w:val="000000"/>
+        </w:rPr>
+        <w:t xml:space="preserve"> the documents to be served.</w:t>
+      </w:r>
+    </w:p>
+    <w:p>
+      <w:pPr>
+        <w:pStyle w:val="Normalforinsertedinstructions"/>
+        <w:rPr>
+          <w:b/>
+          <w:color w:val="000000"/>
+        </w:rPr>
+      </w:pPr>
+      <w:r>
+        <w:rPr>
+          <w:b/>
+          <w:color w:val="000000"/>
+        </w:rPr>
+        <w:t xml:space="preserve">When Court Papers Can’t </w:t>
+      </w:r>
+      <w:proofErr w:type="gramStart"/>
+      <w:r>
+        <w:rPr>
+          <w:b/>
+          <w:color w:val="000000"/>
+        </w:rPr>
+        <w:t>be</w:t>
+      </w:r>
+      <w:proofErr w:type="gramEnd"/>
+      <w:r>
+        <w:rPr>
+          <w:b/>
+          <w:color w:val="000000"/>
+        </w:rPr>
+        <w:t xml:space="preserve"> Served.</w:t>
+      </w:r>
+    </w:p>
+    <w:p>
+      <w:pPr>
+        <w:pStyle w:val="Normalforinsertedinstructions"/>
+        <w:rPr>
+          <w:color w:val="000000"/>
+        </w:rPr>
+      </w:pPr>
+      <w:r>
+        <w:rPr>
+          <w:color w:val="000000"/>
+        </w:rPr>
+        <w:t xml:space="preserve">Sometimes court papers cannot be served because the address of the person to be served is wrong or the whereabouts of the person to be served are unknown. A hearing cannot be held until it can be proven </w:t>
+      </w:r>
+      <w:proofErr w:type="gramStart"/>
+      <w:r>
+        <w:rPr>
+          <w:color w:val="000000"/>
+        </w:rPr>
+        <w:t>to</w:t>
+      </w:r>
+      <w:proofErr w:type="gramEnd"/>
+      <w:r>
+        <w:rPr>
+          <w:color w:val="000000"/>
+        </w:rPr>
+        <w:t xml:space="preserve"> the court that both parties know about the hearing or that every effort was made to serve the court papers. If the other person's copy of the court papers is returned to you as undeliverable, you must contact the PPO Office at 248-303-1534 to discuss the possibility of alternate service. Alternate Service means the court may permit service in another manner that could reasonably give actual notice of the proceedings. Any request for alternate service must be made in a verified motion (FORM MC303).</w:t>
+      </w:r>
+    </w:p>
+    <w:p>
+      <w:pPr>
+        <w:pStyle w:val="Heading3"/>
+      </w:pPr>
+      <w:r>
+        <w:t>Step 7: Attend the hearing</w:t>
+      </w:r>
+    </w:p>
+    <w:p>
+      <w:pPr>
+        <w:pStyle w:val="Normalforinsertedinstructions"/>
+        <w:rPr>
+          <w:color w:val="000000"/>
+        </w:rPr>
+      </w:pPr>
+      <w:r>
+        <w:rPr>
+          <w:color w:val="000000"/>
+        </w:rPr>
+        <w:t xml:space="preserve">{%p if </w:t>
       </w:r>
       <w:proofErr w:type="spellStart"/>
       <w:r>
-        <w:t>MiFile</w:t>
+        <w:t>has_next_friend_</w:t>
+      </w:r>
+      <w:proofErr w:type="gramStart"/>
+      <w:r>
+        <w:t>petitioning</w:t>
       </w:r>
       <w:proofErr w:type="spellEnd"/>
       <w:r>
-        <w:t xml:space="preserve">. For questions about </w:t>
+        <w:rPr>
+          <w:color w:val="000000"/>
+        </w:rPr>
+        <w:t xml:space="preserve"> %}</w:t>
+      </w:r>
+      <w:proofErr w:type="gramEnd"/>
+    </w:p>
+    <w:p>
+      <w:pPr>
+        <w:pStyle w:val="Normalforinsertedinstructions"/>
+        <w:rPr>
+          <w:color w:val="000000"/>
+        </w:rPr>
+      </w:pPr>
+      <w:r>
+        <w:rPr>
+          <w:color w:val="000000"/>
+        </w:rPr>
+        <w:t>Your next friend will need to attend the hearing with you and speak on your behalf.</w:t>
+      </w:r>
+    </w:p>
+    <w:p>
+      <w:pPr>
+        <w:pStyle w:val="Normalforinsertedinstructions"/>
+        <w:rPr>
+          <w:color w:val="000000"/>
+        </w:rPr>
+      </w:pPr>
+      <w:r>
+        <w:rPr>
+          <w:color w:val="000000"/>
+        </w:rPr>
+        <w:t xml:space="preserve">{%p </w:t>
+      </w:r>
+      <w:proofErr w:type="gramStart"/>
+      <w:r>
+        <w:rPr>
+          <w:color w:val="000000"/>
+        </w:rPr>
+        <w:t>endif %}</w:t>
+      </w:r>
+      <w:proofErr w:type="gramEnd"/>
+    </w:p>
+    <w:p>
+      <w:pPr>
+        <w:pStyle w:val="Normalforinsertedinstructions"/>
+        <w:rPr>
+          <w:color w:val="000000"/>
+        </w:rPr>
+      </w:pPr>
+      <w:r>
+        <w:rPr>
+          <w:color w:val="000000"/>
+        </w:rPr>
+        <w:t xml:space="preserve">These are brief instructions about attending your court hearing. For more detailed instructions about going to court, watch the </w:t>
+      </w:r>
+      <w:hyperlink r:id="rId11">
+        <w:r>
+          <w:rPr>
+            <w:color w:val="0563C1"/>
+            <w:u w:val="single"/>
+          </w:rPr>
+          <w:t>Going to Court</w:t>
+        </w:r>
+      </w:hyperlink>
+      <w:r>
+        <w:rPr>
+          <w:color w:val="000000"/>
+        </w:rPr>
+        <w:t xml:space="preserve"> video.</w:t>
+      </w:r>
+    </w:p>
+    <w:p>
+      <w:pPr>
+        <w:pStyle w:val="Normalforinsertedinstructions"/>
+        <w:rPr>
+          <w:color w:val="000000"/>
+        </w:rPr>
+      </w:pPr>
+      <w:r>
+        <w:rPr>
+          <w:color w:val="000000"/>
+        </w:rPr>
+        <w:t xml:space="preserve">Your court hearing might be in person at the courthouse or online through the Zoom platform. Below you will find information about both types of </w:t>
+      </w:r>
+      <w:proofErr w:type="gramStart"/>
+      <w:r>
+        <w:rPr>
+          <w:color w:val="000000"/>
+        </w:rPr>
+        <w:t>hearings</w:t>
+      </w:r>
+      <w:proofErr w:type="gramEnd"/>
+      <w:r>
+        <w:rPr>
+          <w:color w:val="000000"/>
+        </w:rPr>
+        <w:t>.</w:t>
+      </w:r>
+    </w:p>
+    <w:p>
+      <w:pPr>
+        <w:pStyle w:val="Heading4"/>
+      </w:pPr>
+      <w:r>
+        <w:t>Zoom hearing:</w:t>
+      </w:r>
+    </w:p>
+    <w:p>
+      <w:pPr>
+        <w:pStyle w:val="Normalforinsertedinstructions"/>
+      </w:pPr>
+      <w:r>
+        <w:t>Follow the instructions provided by the court to connect to your Zoom hearing. This is a court proceeding and appropriate conduct and attire is required.</w:t>
+      </w:r>
+    </w:p>
+    <w:p>
+      <w:pPr>
+        <w:pStyle w:val="BulletedList"/>
+      </w:pPr>
+      <w:r>
+        <w:t>All participants are required to appear on camera.</w:t>
+      </w:r>
+    </w:p>
+    <w:p>
+      <w:pPr>
+        <w:pStyle w:val="BulletedList"/>
+      </w:pPr>
+      <w:r>
+        <w:t>The Court may permit a party’s request to appear by audio only if the individual does not have the technological ability to appear on camera.</w:t>
+      </w:r>
+    </w:p>
+    <w:p>
+      <w:pPr>
+        <w:pStyle w:val="BulletedList"/>
+      </w:pPr>
+      <w:r>
+        <w:t>Remote participants must use a private, indoor, quiet room with adequate lighting that will be free of interruptions.</w:t>
+      </w:r>
+    </w:p>
+    <w:p>
+      <w:pPr>
+        <w:pStyle w:val="BulletedList"/>
+      </w:pPr>
+      <w:r>
+        <w:t>The Court retains its contempt powers to sanction individuals participating remotely.</w:t>
+      </w:r>
+    </w:p>
+    <w:p>
+      <w:pPr>
+        <w:pStyle w:val="Normalforinsertedinstructions"/>
+      </w:pPr>
+      <w:r>
+        <w:lastRenderedPageBreak/>
+        <w:t>Be prepared to answer questions from the judge about why you need a PPO. Answer the judge’s questions clearly and directly. The Respondent will also have a turn to speak.</w:t>
+      </w:r>
+    </w:p>
+    <w:p>
+      <w:pPr>
+        <w:pStyle w:val="Normalforinsertedinstructions"/>
+      </w:pPr>
+      <w:r>
+        <w:t>If the judge decides to grant you a PPO, the court will send you a copy of the order. You may want to make a copy for your employer, your child’s school or childcare provider, and several copies to keep in your home, car, etc. If the judge grants you a PPO, you will need to have the Respondent served with a copy of it (See Step 8).</w:t>
+      </w:r>
+    </w:p>
+    <w:p>
+      <w:pPr>
+        <w:pStyle w:val="Normalforinsertedinstructions"/>
+      </w:pPr>
+      <w:r>
+        <w:t>If the judge does not grant a PPO, the court will send you a copy of the denial order.</w:t>
+      </w:r>
+    </w:p>
+    <w:p>
+      <w:pPr>
+        <w:pStyle w:val="Heading4"/>
+      </w:pPr>
+      <w:r>
+        <w:t>Hearing at the courthouse:</w:t>
+      </w:r>
+    </w:p>
+    <w:p>
+      <w:pPr>
+        <w:pStyle w:val="Normalforinsertedinstructions"/>
+      </w:pPr>
+      <w:r>
+        <w:t>Go to the court on the scheduled day and time. Bring your proposed order to the hearing. Dress neatly. Arrive 10 or 15 minutes before your scheduled hearing time. Go to the clerk and tell them your name, that you are there for a hearing, and that you are representing yourself. Follow the clerk’s directions and do not interrupt any hearing in progress.</w:t>
+      </w:r>
+    </w:p>
+    <w:p>
+      <w:pPr>
+        <w:pStyle w:val="Normalforinsertedinstructions"/>
+      </w:pPr>
+      <w:r>
+        <w:t>Be prepared to answer questions from the judge about why you need a PPO.</w:t>
+      </w:r>
+    </w:p>
+    <w:p>
+      <w:pPr>
+        <w:pStyle w:val="Normalforinsertedinstructions"/>
+      </w:pPr>
+      <w:r>
+        <w:t>When you are called, go to the place you are directed and answer the judge’s questions clearly and directly. The Respondent will also have a turn to speak.</w:t>
+      </w:r>
+    </w:p>
+    <w:p>
+      <w:pPr>
+        <w:pStyle w:val="Normalforinsertedinstructions"/>
+      </w:pPr>
+      <w:r>
+        <w:t>If the judge decides to grant you a PPO, the judge will ask you for your order so they can fill it out and sign it. The court will give you and the Respondent a copy of the order. Ask the courtroom clerk for four (or more) copies of the order. You may want a copy for your employer, your child’s school or childcare provider, and several copies to keep in your home, car, etc.</w:t>
+      </w:r>
+    </w:p>
+    <w:p>
+      <w:pPr>
+        <w:pStyle w:val="Normalforinsertedinstructions"/>
+      </w:pPr>
+      <w:r>
+        <w:t>If the judge grants you a PPO, you will need to have the Respondent served with a copy of it (See Step 8).</w:t>
+      </w:r>
+    </w:p>
+    <w:p>
+      <w:pPr>
+        <w:pStyle w:val="Normalforinsertedinstructions"/>
+      </w:pPr>
+      <w:r>
+        <w:t>If the judge decides not to grant you a PPO, the court will give you an order denying a PPO.</w:t>
+      </w:r>
+    </w:p>
+    <w:p>
+      <w:pPr>
+        <w:pStyle w:val="Heading3"/>
+      </w:pPr>
+      <w:r>
+        <w:t>Step 8: Have the Respondent served with the order</w:t>
+      </w:r>
+    </w:p>
+    <w:p>
+      <w:pPr>
+        <w:pStyle w:val="Normalforinsertedinstructions"/>
+      </w:pPr>
+      <w:proofErr w:type="gramStart"/>
+      <w:r>
+        <w:t>{%p if</w:t>
+      </w:r>
+      <w:proofErr w:type="gramEnd"/>
+      <w:r>
+        <w:t xml:space="preserve"> </w:t>
       </w:r>
       <w:proofErr w:type="spellStart"/>
       <w:r>
-        <w:t>MiFile</w:t>
+        <w:t>respondent_is_minor</w:t>
       </w:r>
       <w:proofErr w:type="spellEnd"/>
       <w:r>
-        <w:t>, contact the Court Clerk’s Office at 248-858-0582.</w:t>
-      </w:r>
-    </w:p>
-    <w:p>
-      <w:pPr>
-        <w:pStyle w:val="Normalforinsertedinstructions"/>
-      </w:pPr>
+        <w:t xml:space="preserve"> and not </w:t>
+      </w:r>
+      <w:proofErr w:type="spellStart"/>
+      <w:r>
+        <w:t>respondent_is_emancipated_</w:t>
+      </w:r>
+      <w:proofErr w:type="gramStart"/>
+      <w:r>
+        <w:t>minor</w:t>
+      </w:r>
+      <w:proofErr w:type="spellEnd"/>
+      <w:r>
+        <w:t xml:space="preserve"> %}</w:t>
+      </w:r>
+      <w:proofErr w:type="gramEnd"/>
+    </w:p>
+    <w:p>
+      <w:pPr>
+        <w:pStyle w:val="Normalforinsertedinstructions"/>
+        <w:rPr>
+          <w:b/>
+          <w:color w:val="000000"/>
+        </w:rPr>
+      </w:pPr>
+      <w:r>
+        <w:rPr>
+          <w:b/>
+          <w:color w:val="000000"/>
+        </w:rPr>
+        <w:t>If the respondent is a minor, also have a copy of the order served on the respondent’s parent(s), guardian(s), or custodian(s), if you know their location.</w:t>
+      </w:r>
+    </w:p>
+    <w:p>
+      <w:pPr>
+        <w:pStyle w:val="Normalforinsertedinstructions"/>
+      </w:pPr>
+      <w:r>
+        <w:t xml:space="preserve">{%p </w:t>
+      </w:r>
+      <w:proofErr w:type="gramStart"/>
+      <w:r>
+        <w:t>endif %}</w:t>
+      </w:r>
+      <w:proofErr w:type="gramEnd"/>
+    </w:p>
+    <w:p>
+      <w:pPr>
+        <w:pStyle w:val="Normalforinsertedinstructions"/>
+        <w:rPr>
+          <w:color w:val="000000"/>
+        </w:rPr>
+      </w:pPr>
+      <w:r>
+        <w:rPr>
+          <w:color w:val="000000"/>
+        </w:rPr>
+        <w:t>If the court granted you a Personal Protection Order and they did not give a copy to the Respondent at the hearing, you must arrange to have the Respondent served with a copy.</w:t>
+      </w:r>
+    </w:p>
+    <w:p>
+      <w:pPr>
+        <w:pStyle w:val="Normalforinsertedinstructions"/>
+        <w:rPr>
+          <w:b/>
+          <w:color w:val="000000"/>
+        </w:rPr>
+      </w:pPr>
+      <w:r>
+        <w:rPr>
+          <w:b/>
+          <w:color w:val="000000"/>
+        </w:rPr>
+        <w:t>Have the Personal Protection Order served (sent or given to) the Respondent.</w:t>
+      </w:r>
+      <w:r>
+        <w:rPr>
+          <w:color w:val="000000"/>
+        </w:rPr>
+        <w:t xml:space="preserve"> This can be done by a police officer, professional process server, or someone else who is 18 years or older. </w:t>
+      </w:r>
+      <w:r>
+        <w:t xml:space="preserve">{% if </w:t>
+      </w:r>
+      <w:proofErr w:type="spellStart"/>
+      <w:r>
+        <w:t>has_next_friend_petitioning</w:t>
+      </w:r>
+      <w:proofErr w:type="spellEnd"/>
+      <w:r>
+        <w:t xml:space="preserve"> </w:t>
+      </w:r>
+      <w:proofErr w:type="gramStart"/>
+      <w:r>
+        <w:t>%}</w:t>
+      </w:r>
       <w:r>
         <w:rPr>
           <w:b/>
           <w:bCs/>
-        </w:rPr>
-        <w:t xml:space="preserve">If you want to schedule your petition for a hearing </w:t>
-      </w:r>
+          <w:color w:val="000000"/>
+        </w:rPr>
+        <w:t>Neither</w:t>
+      </w:r>
+      <w:proofErr w:type="gramEnd"/>
       <w:r>
         <w:rPr>
           <w:b/>
           <w:bCs/>
-          <w:u w:val="single"/>
-        </w:rPr>
-        <w:t>instead of</w:t>
-      </w:r>
+          <w:color w:val="000000"/>
+        </w:rPr>
+        <w:t xml:space="preserve"> you nor your next friend is allowed to serve the </w:t>
+      </w:r>
+      <w:proofErr w:type="gramStart"/>
       <w:r>
         <w:rPr>
           <w:b/>
           <w:bCs/>
-        </w:rPr>
-        <w:t xml:space="preserve"> filing it as an ex </w:t>
+          <w:color w:val="000000"/>
+        </w:rPr>
+        <w:t>Respondent.</w:t>
+      </w:r>
+      <w:r>
+        <w:t>{</w:t>
+      </w:r>
+      <w:proofErr w:type="gramEnd"/>
+      <w:r>
+        <w:t>%</w:t>
+      </w:r>
+      <w:r>
+        <w:t xml:space="preserve"> else</w:t>
+      </w:r>
+      <w:r>
+        <w:t xml:space="preserve"> </w:t>
+      </w:r>
+      <w:proofErr w:type="gramStart"/>
+      <w:r>
+        <w:t>%}</w:t>
+      </w:r>
+      <w:r>
+        <w:rPr>
+          <w:b/>
+          <w:color w:val="000000"/>
+        </w:rPr>
+        <w:t>Do</w:t>
+      </w:r>
+      <w:proofErr w:type="gramEnd"/>
+      <w:r>
+        <w:rPr>
+          <w:b/>
+          <w:color w:val="000000"/>
+        </w:rPr>
+        <w:t xml:space="preserve"> not serve the Respondent </w:t>
+      </w:r>
+      <w:proofErr w:type="gramStart"/>
+      <w:r>
+        <w:rPr>
+          <w:b/>
+          <w:color w:val="000000"/>
+        </w:rPr>
+        <w:t>yourself.</w:t>
+      </w:r>
+      <w:r>
+        <w:t>{</w:t>
+      </w:r>
+      <w:proofErr w:type="gramEnd"/>
+      <w:r>
+        <w:t xml:space="preserve">% </w:t>
+      </w:r>
+      <w:proofErr w:type="gramStart"/>
+      <w:r>
+        <w:t>endif %}</w:t>
+      </w:r>
+      <w:proofErr w:type="gramEnd"/>
+    </w:p>
+    <w:p>
+      <w:pPr>
+        <w:pStyle w:val="Normalforinsertedinstructions"/>
+        <w:rPr>
+          <w:color w:val="000000"/>
+        </w:rPr>
+      </w:pPr>
+      <w:r>
+        <w:rPr>
+          <w:color w:val="000000"/>
+        </w:rPr>
+        <w:t>If you would like the Sheriff’s Office Civil Unit to serve the respondent for you, you may go to the Civil Unit Office after your hearing to arrange service. The Sheriff’s Office Civil Unit Office is on the 1st floor of the courthouse, north entrance hallway, second door on the right. Their telephone number is 248-452-9725.</w:t>
+      </w:r>
+    </w:p>
+    <w:p>
+      <w:pPr>
+        <w:pStyle w:val="Normalforinsertedinstructions"/>
+        <w:rPr>
+          <w:color w:val="000000"/>
+        </w:rPr>
+      </w:pPr>
+      <w:r>
+        <w:rPr>
+          <w:color w:val="000000"/>
+        </w:rPr>
+        <w:lastRenderedPageBreak/>
+        <w:t xml:space="preserve">The papers can also be served by registered mail with </w:t>
+      </w:r>
+      <w:proofErr w:type="gramStart"/>
+      <w:r>
+        <w:rPr>
+          <w:color w:val="000000"/>
+        </w:rPr>
+        <w:t>return</w:t>
+      </w:r>
+      <w:proofErr w:type="gramEnd"/>
+      <w:r>
+        <w:rPr>
+          <w:color w:val="000000"/>
+        </w:rPr>
+        <w:t xml:space="preserve"> receipt requested and delivery restricted to the Respondent. Even if the Respondent is served by mail, you need to find someone else to do the mailing. </w:t>
+      </w:r>
+      <w:r>
+        <w:rPr>
+          <w:color w:val="202124"/>
+        </w:rPr>
+        <w:t>The server’s address—not yours—should be the one on the return receipt.</w:t>
+      </w:r>
+      <w:r>
+        <w:rPr>
+          <w:color w:val="000000"/>
+        </w:rPr>
+        <w:t xml:space="preserve"> To learn more, read </w:t>
+      </w:r>
+      <w:hyperlink r:id="rId12">
+        <w:r>
+          <w:rPr>
+            <w:color w:val="0563C1"/>
+            <w:u w:val="single"/>
+          </w:rPr>
+          <w:t>Serving Your Personal Protection Order</w:t>
+        </w:r>
+      </w:hyperlink>
+      <w:r>
+        <w:rPr>
+          <w:color w:val="000000"/>
+        </w:rPr>
+        <w:t>.</w:t>
+      </w:r>
+    </w:p>
+    <w:p>
+      <w:pPr>
+        <w:pStyle w:val="Normalforinsertedinstructions"/>
+        <w:rPr>
+          <w:color w:val="000000"/>
+        </w:rPr>
+      </w:pPr>
+      <w:r>
+        <w:rPr>
+          <w:color w:val="000000"/>
+        </w:rPr>
+        <w:t>If the judge signed an order denying a PPO, the court will take care of serving the Respondent with the denial order.</w:t>
+      </w:r>
+    </w:p>
+    <w:p>
+      <w:pPr>
+        <w:pStyle w:val="Heading3"/>
+      </w:pPr>
+      <w:r>
+        <w:t xml:space="preserve">Step 9: File </w:t>
+      </w:r>
+      <w:proofErr w:type="gramStart"/>
+      <w:r>
+        <w:t>the completed</w:t>
+      </w:r>
+      <w:proofErr w:type="gramEnd"/>
+      <w:r>
+        <w:t xml:space="preserve"> Proof of Service</w:t>
+      </w:r>
+    </w:p>
+    <w:p>
+      <w:pPr>
+        <w:pStyle w:val="Normalforinsertedinstructions"/>
+        <w:rPr>
+          <w:color w:val="000000"/>
+        </w:rPr>
+      </w:pPr>
+      <w:r>
+        <w:rPr>
+          <w:color w:val="000000"/>
+        </w:rPr>
+        <w:t xml:space="preserve">{%p if </w:t>
       </w:r>
       <w:proofErr w:type="spellStart"/>
       <w:r>
-        <w:rPr>
-          <w:b/>
-          <w:bCs/>
-        </w:rPr>
-        <w:t>parte</w:t>
+        <w:t>has_next_friend_</w:t>
+      </w:r>
+      <w:proofErr w:type="gramStart"/>
+      <w:r>
+        <w:t>petitioning</w:t>
       </w:r>
       <w:proofErr w:type="spellEnd"/>
       <w:r>
         <w:rPr>
-          <w:b/>
-          <w:bCs/>
-        </w:rPr>
-        <w:t xml:space="preserve"> petition:</w:t>
-      </w:r>
-    </w:p>
-    <w:p>
-      <w:pPr>
-        <w:pStyle w:val="Normalforinsertedinstructions"/>
-      </w:pPr>
-      <w:r>
-        <w:t>The court will schedule the hearing for you. The PPO Office will email you the completed Notice of Hearing and Zoom Hearing Instructions (if applicable).</w:t>
-      </w:r>
-    </w:p>
-    <w:p>
-      <w:pPr>
-        <w:pStyle w:val="Heading3"/>
-      </w:pPr>
-      <w:r>
-        <w:t xml:space="preserve">Step 5: Have the Respondent served </w:t>
-      </w:r>
-    </w:p>
-    <w:p>
-      <w:pPr>
-        <w:pStyle w:val="Normalforinsertedinstructions"/>
-        <w:rPr>
-          <w:color w:val="000000"/>
-        </w:rPr>
-      </w:pPr>
-      <w:r>
-        <w:rPr>
-          <w:color w:val="000000"/>
-        </w:rPr>
-        <w:t xml:space="preserve">Have the PPO documents served to the Respondent at least </w:t>
-      </w:r>
-      <w:r>
-        <w:rPr>
-          <w:color w:val="000000"/>
-        </w:rPr>
-        <w:t>one day [if domestic relationship or nondomestic stalking] two days [if nondomestic SA]</w:t>
-      </w:r>
-      <w:r>
-        <w:rPr>
-          <w:color w:val="000000"/>
-        </w:rPr>
-        <w:t xml:space="preserve"> before the hearing.</w:t>
-      </w:r>
-      <w:r>
-        <w:rPr>
-          <w:color w:val="000000"/>
-        </w:rPr>
-        <w:t xml:space="preserve"> </w:t>
-      </w:r>
-      <w:r>
-        <w:rPr>
-          <w:color w:val="000000"/>
-        </w:rPr>
-        <w:t>You can find instructions for service in the confirmation email that the PPO Office sent you after you submitted your petition to the court. The instructions are in the attachment called “Procedural Instructions for PPO."</w:t>
-      </w:r>
-    </w:p>
-    <w:p>
-      <w:pPr>
-        <w:pStyle w:val="Normalforinsertedinstructions"/>
-        <w:rPr>
-          <w:color w:val="000000"/>
-        </w:rPr>
-      </w:pPr>
-      <w:r>
-        <w:rPr>
-          <w:b/>
-          <w:bCs/>
-          <w:color w:val="000000"/>
-        </w:rPr>
-        <w:t xml:space="preserve">Gather what you need for </w:t>
-      </w:r>
-      <w:r>
-        <w:rPr>
-          <w:b/>
-          <w:bCs/>
-          <w:color w:val="000000"/>
-        </w:rPr>
-        <w:t>service</w:t>
-      </w:r>
-      <w:r>
-        <w:rPr>
-          <w:b/>
-          <w:bCs/>
-          <w:color w:val="000000"/>
-        </w:rPr>
-        <w:t>. You will need a copy of each of the following:</w:t>
-      </w:r>
-    </w:p>
-    <w:p>
-      <w:pPr>
-        <w:pStyle w:val="BulletedList"/>
-      </w:pPr>
-      <w:r>
-        <w:t>Petition for Personal Protection Order, including the Statement of Facts</w:t>
-      </w:r>
-    </w:p>
-    <w:p>
-      <w:pPr>
-        <w:pStyle w:val="BulletedList"/>
-      </w:pPr>
-      <w:r>
-        <w:t>Notice of Hearing on Petition for Personal Protection Order</w:t>
-      </w:r>
-    </w:p>
-    <w:p>
-      <w:pPr>
-        <w:pStyle w:val="BulletedList"/>
-      </w:pPr>
-      <w:r>
-        <w:t xml:space="preserve">Any attachments you filed with your petition (examples: police reports, medical records, </w:t>
-      </w:r>
-      <w:proofErr w:type="spellStart"/>
-      <w:r>
-        <w:t>etc</w:t>
-      </w:r>
-      <w:proofErr w:type="spellEnd"/>
-      <w:r>
-        <w:t xml:space="preserve"> that are related to your petition)</w:t>
-      </w:r>
-    </w:p>
-    <w:p>
-      <w:pPr>
-        <w:pStyle w:val="BulletedList"/>
-      </w:pPr>
-      <w:r>
-        <w:t>Zoom instructions from the court (if they sent you Zoom instructions)</w:t>
-      </w:r>
-    </w:p>
-    <w:p>
-      <w:pPr>
-        <w:pStyle w:val="Normalforinsertedinstructions"/>
-        <w:rPr>
-          <w:color w:val="000000"/>
-        </w:rPr>
-      </w:pPr>
-      <w:r>
-        <w:rPr>
-          <w:color w:val="000000"/>
-        </w:rPr>
-        <w:t xml:space="preserve">If you choose to, you may have the Oakland County Sheriff’s Office </w:t>
-      </w:r>
-      <w:r>
-        <w:rPr>
-          <w:color w:val="000000"/>
-        </w:rPr>
-        <w:t xml:space="preserve">Civil Unit </w:t>
-      </w:r>
-      <w:r>
-        <w:rPr>
-          <w:color w:val="000000"/>
-        </w:rPr>
-        <w:t xml:space="preserve">serve the Respondent. Contact information for the Oakland County Sheriff’s Office Civil </w:t>
-      </w:r>
-      <w:r>
-        <w:rPr>
-          <w:color w:val="000000"/>
-        </w:rPr>
-        <w:t xml:space="preserve">Unit </w:t>
-      </w:r>
-      <w:r>
-        <w:rPr>
-          <w:color w:val="000000"/>
-        </w:rPr>
-        <w:t>can be found in the “Procedural Instructions for PPO" document</w:t>
-      </w:r>
-      <w:r>
-        <w:rPr>
-          <w:color w:val="000000"/>
-        </w:rPr>
-        <w:t xml:space="preserve">. Contact the Oakland County Sheriff’s Office Civil Unit </w:t>
-      </w:r>
-      <w:r>
-        <w:rPr>
-          <w:b/>
-          <w:color w:val="FF0000"/>
-          <w:u w:val="single"/>
-        </w:rPr>
-        <w:t>BEFORE</w:t>
-      </w:r>
-      <w:r>
-        <w:rPr>
-          <w:color w:val="000000"/>
-        </w:rPr>
-        <w:t xml:space="preserve"> you make copies of the PPO documents to get additional instructions from them.</w:t>
-      </w:r>
-    </w:p>
-    <w:p>
-      <w:pPr>
-        <w:pStyle w:val="Normalforinsertedinstructions"/>
-        <w:rPr>
-          <w:b/>
-          <w:color w:val="000000"/>
-        </w:rPr>
-      </w:pPr>
-      <w:r>
-        <w:rPr>
-          <w:color w:val="000000"/>
-        </w:rPr>
-        <w:t xml:space="preserve">If you don’t want the Sheriff’s Office Civil Unit to serve for you, service can be completed by a professional process server, or an adult friend or relative. </w:t>
-      </w:r>
-      <w:r>
-        <w:t xml:space="preserve">{% if </w:t>
-      </w:r>
-      <w:proofErr w:type="spellStart"/>
-      <w:r>
-        <w:t>has_next_friend_petitioning</w:t>
-      </w:r>
-      <w:proofErr w:type="spellEnd"/>
-      <w:r>
+          <w:color w:val="000000"/>
+        </w:rPr>
         <w:t xml:space="preserve"> %}</w:t>
       </w:r>
-      <w:r>
-        <w:rPr>
-          <w:b/>
-          <w:bCs/>
-          <w:color w:val="000000"/>
-        </w:rPr>
-        <w:t>Neither you nor your next friend is allowed to serve the Respondent.</w:t>
-      </w:r>
-      <w:r>
-        <w:rPr>
-          <w:b/>
-          <w:bCs/>
-          <w:color w:val="000000"/>
-        </w:rPr>
-        <w:t xml:space="preserve"> </w:t>
-      </w:r>
-      <w:r>
-        <w:t>{%</w:t>
-      </w:r>
-      <w:r>
-        <w:t xml:space="preserve"> else</w:t>
-      </w:r>
-      <w:r>
-        <w:t xml:space="preserve"> %}</w:t>
-      </w:r>
-      <w:r>
-        <w:rPr>
-          <w:b/>
-          <w:color w:val="000000"/>
-        </w:rPr>
-        <w:t>You cannot serve the Respondent yourself.</w:t>
-      </w:r>
-      <w:r>
-        <w:t xml:space="preserve"> </w:t>
-      </w:r>
-      <w:r>
-        <w:t>{% endif %}</w:t>
-      </w:r>
-    </w:p>
-    <w:p>
-      <w:pPr>
-        <w:pStyle w:val="Normalforinsertedinstructions"/>
-        <w:rPr>
-          <w:color w:val="000000"/>
-        </w:rPr>
-      </w:pPr>
-      <w:r>
-        <w:rPr>
-          <w:color w:val="000000"/>
-        </w:rPr>
-        <w:t>You will need the Respondent's address and any other information that will help the process server find the Respondent.</w:t>
-      </w:r>
-    </w:p>
-    <w:p>
-      <w:pPr>
-        <w:pStyle w:val="Normalforinsertedinstructions"/>
-        <w:rPr>
-          <w:color w:val="000000"/>
-        </w:rPr>
-      </w:pPr>
-      <w:r>
-        <w:rPr>
-          <w:color w:val="000000"/>
-        </w:rPr>
-        <w:lastRenderedPageBreak/>
-        <w:t xml:space="preserve">The process server can give the Respondent the papers in person. Or the papers can be sent to the Respondent by registered mail with return receipt requested and delivery restricted to the Respondent. If the Respondent is served by mail, they must sign and return the green card (the return receipt). Even if the Respondent is served by mail, you need to find someone else to do the mailing. </w:t>
-      </w:r>
-      <w:r>
-        <w:rPr>
-          <w:color w:val="202124"/>
-        </w:rPr>
-        <w:t>The server’s address—not yours—should be the one on the r</w:t>
-      </w:r>
-      <w:r>
-        <w:rPr>
-          <w:color w:val="000000"/>
-        </w:rPr>
-        <w:t xml:space="preserve">eturn receipt. </w:t>
-      </w:r>
-    </w:p>
-    <w:p>
-      <w:pPr>
-        <w:pStyle w:val="Normalforinsertedinstructions"/>
-        <w:rPr>
-          <w:color w:val="000000"/>
-        </w:rPr>
-      </w:pPr>
-      <w:r>
-        <w:rPr>
-          <w:color w:val="000000"/>
-        </w:rPr>
-        <w:t xml:space="preserve">{%p if </w:t>
-      </w:r>
-      <w:proofErr w:type="spellStart"/>
-      <w:r>
-        <w:rPr>
-          <w:color w:val="000000"/>
-        </w:rPr>
-        <w:t>respondent_is_minor</w:t>
-      </w:r>
-      <w:proofErr w:type="spellEnd"/>
-      <w:r>
-        <w:rPr>
-          <w:color w:val="000000"/>
-        </w:rPr>
-        <w:t xml:space="preserve"> and not </w:t>
-      </w:r>
-      <w:proofErr w:type="spellStart"/>
-      <w:r>
-        <w:rPr>
-          <w:color w:val="000000"/>
-        </w:rPr>
-        <w:t>respondent_is_emancipated_minor</w:t>
-      </w:r>
-      <w:proofErr w:type="spellEnd"/>
-      <w:r>
-        <w:rPr>
-          <w:color w:val="000000"/>
-        </w:rPr>
-        <w:t xml:space="preserve"> %}</w:t>
-      </w:r>
-    </w:p>
-    <w:p>
-      <w:pPr>
-        <w:pStyle w:val="Normalforinsertedinstructions"/>
-        <w:rPr>
-          <w:color w:val="000000"/>
-        </w:rPr>
-      </w:pPr>
-      <w:r>
-        <w:rPr>
-          <w:b/>
-          <w:color w:val="000000"/>
-        </w:rPr>
-        <w:t>If the Respondent is a minor</w:t>
-      </w:r>
-      <w:r>
-        <w:rPr>
-          <w:color w:val="000000"/>
-        </w:rPr>
-        <w:t xml:space="preserve">, you must also have copies of the forms served on the Respondent’s parent(s), guardian(s), or custodian(s), if you know their location. </w:t>
-      </w:r>
-    </w:p>
-    <w:p>
-      <w:pPr>
-        <w:pStyle w:val="Normalforinsertedinstructions"/>
-        <w:rPr>
-          <w:color w:val="000000"/>
-        </w:rPr>
-      </w:pPr>
-      <w:r>
-        <w:rPr>
-          <w:color w:val="000000"/>
-        </w:rPr>
-        <w:t>{%p endif %}</w:t>
-      </w:r>
-    </w:p>
-    <w:p>
-      <w:pPr>
-        <w:pStyle w:val="Heading3"/>
-      </w:pPr>
-      <w:r>
-        <w:t>Step 6: File the completed Proof of Service</w:t>
-      </w:r>
-    </w:p>
-    <w:p>
-      <w:pPr>
-        <w:pStyle w:val="Normalforinsertedinstructions"/>
-        <w:rPr>
-          <w:color w:val="000000"/>
-        </w:rPr>
-      </w:pPr>
-      <w:r>
-        <w:rPr>
-          <w:color w:val="000000"/>
-        </w:rPr>
-        <w:t xml:space="preserve">{%p if </w:t>
-      </w:r>
-      <w:proofErr w:type="spellStart"/>
-      <w:r>
-        <w:t>has_next_friend_petitioning</w:t>
-      </w:r>
-      <w:proofErr w:type="spellEnd"/>
-      <w:r>
-        <w:rPr>
-          <w:color w:val="000000"/>
-        </w:rPr>
-        <w:t xml:space="preserve"> %}</w:t>
-      </w:r>
+      <w:proofErr w:type="gramEnd"/>
     </w:p>
     <w:p>
       <w:pPr>
@@ -1291,51 +1982,53 @@
         <w:rPr>
           <w:color w:val="000000"/>
         </w:rPr>
-        <w:t>{%p endif %}</w:t>
-      </w:r>
-    </w:p>
-    <w:p>
-      <w:pPr>
-        <w:pStyle w:val="Normalforinsertedinstructions"/>
-        <w:rPr>
-          <w:color w:val="000000"/>
-        </w:rPr>
-      </w:pPr>
-      <w:r>
-        <w:rPr>
-          <w:color w:val="000000"/>
-        </w:rPr>
-        <w:t>After the Respondent is served with the PPO papers, the server must complete the Proof of Service form.</w:t>
-      </w:r>
-    </w:p>
-    <w:p>
-      <w:pPr>
-        <w:pStyle w:val="Normalforinsertedinstructions"/>
-        <w:rPr>
-          <w:color w:val="000000"/>
-        </w:rPr>
-      </w:pPr>
-      <w:r>
-        <w:rPr>
-          <w:color w:val="000000"/>
-        </w:rPr>
-        <w:t>You may want to make copies of the completed Proof of Service form for your own records.</w:t>
-      </w:r>
-    </w:p>
-    <w:p>
-      <w:pPr>
-        <w:pStyle w:val="Normalforinsertedinstructions"/>
-        <w:rPr>
-          <w:color w:val="000000"/>
-        </w:rPr>
-      </w:pPr>
-      <w:r>
-        <w:rPr>
-          <w:color w:val="000000"/>
-        </w:rPr>
-        <w:t xml:space="preserve">File the Proof of Service form with the court through </w:t>
-      </w:r>
-      <w:hyperlink r:id="rId12" w:history="1">
+        <w:t xml:space="preserve">{%p </w:t>
+      </w:r>
+      <w:proofErr w:type="gramStart"/>
+      <w:r>
+        <w:rPr>
+          <w:color w:val="000000"/>
+        </w:rPr>
+        <w:t>endif %}</w:t>
+      </w:r>
+      <w:proofErr w:type="gramEnd"/>
+    </w:p>
+    <w:p>
+      <w:pPr>
+        <w:pStyle w:val="Normalforinsertedinstructions"/>
+        <w:rPr>
+          <w:color w:val="000000"/>
+        </w:rPr>
+      </w:pPr>
+      <w:r>
+        <w:rPr>
+          <w:color w:val="000000"/>
+        </w:rPr>
+        <w:t>When you used the Do-It-Yourself Personal Protection Order (PPO) tool, you got a Proof of Service with the PPO.</w:t>
+      </w:r>
+    </w:p>
+    <w:p>
+      <w:pPr>
+        <w:pStyle w:val="Normalforinsertedinstructions"/>
+      </w:pPr>
+      <w:r>
+        <w:t xml:space="preserve">Have the server complete and sign the Proof of Service. This tells the court how and where the Respondent was served with the PPO. </w:t>
+      </w:r>
+    </w:p>
+    <w:p>
+      <w:pPr>
+        <w:pStyle w:val="Normalforinsertedinstructions"/>
+        <w:rPr>
+          <w:color w:val="000000"/>
+        </w:rPr>
+      </w:pPr>
+      <w:r>
+        <w:rPr>
+          <w:color w:val="222222"/>
+        </w:rPr>
+        <w:t xml:space="preserve">Make sure that you file the Proof of Service with the court through </w:t>
+      </w:r>
+      <w:hyperlink r:id="rId13" w:history="1">
         <w:proofErr w:type="spellStart"/>
         <w:r>
           <w:rPr>
@@ -1350,615 +2043,29 @@
         <w:rPr>
           <w:color w:val="000000"/>
         </w:rPr>
-        <w:t xml:space="preserve">. If the Respondent was served by mail, the green card signed by the Respondent (the return receipt) must also be filed. </w:t>
-      </w:r>
-      <w:r>
-        <w:rPr>
-          <w:color w:val="000000"/>
-        </w:rPr>
-        <w:t>Instructions for filing the Proof of Service can be found in the confirmation email you got from the PPO Office after you filed. Look in the attachment called “Procedural Instructions for PPO.” </w:t>
-      </w:r>
-    </w:p>
-    <w:p>
-      <w:pPr>
-        <w:pStyle w:val="Normalforinsertedinstructions"/>
-        <w:rPr>
-          <w:b/>
-          <w:color w:val="000000"/>
-        </w:rPr>
-      </w:pPr>
-      <w:r>
-        <w:rPr>
-          <w:b/>
-          <w:color w:val="000000"/>
-        </w:rPr>
-        <w:t>When Court Papers Can’t be Served.</w:t>
-      </w:r>
-    </w:p>
-    <w:p>
-      <w:pPr>
-        <w:pStyle w:val="Normalforinsertedinstructions"/>
-        <w:rPr>
-          <w:color w:val="000000"/>
-        </w:rPr>
-      </w:pPr>
-      <w:r>
-        <w:rPr>
-          <w:color w:val="000000"/>
-        </w:rPr>
-        <w:t>Sometimes court papers cannot be served because the address of the person to be served is wrong or the whereabouts of the person to be served are unknown. A hearing cannot be held until it can be proven to the court that both parties know about the hearing or that every effort was made to serve the court papers. If the other person's copy of the court papers is returned to you as undeliverable, you must contact the PPO Office at 248-303-1534 to discuss the possibility of alternate service. Alternate Service means the court may permit service in another manner that could reasonably give actual notice of the proceedings. Any request for alternate service must be made in a verified motion (FORM MC303).</w:t>
-      </w:r>
-    </w:p>
-    <w:p>
-      <w:pPr>
-        <w:pStyle w:val="Heading3"/>
-      </w:pPr>
-      <w:r>
-        <w:t>Step 7: Attend the hearing</w:t>
-      </w:r>
-    </w:p>
-    <w:p>
-      <w:pPr>
-        <w:pStyle w:val="Normalforinsertedinstructions"/>
-        <w:rPr>
-          <w:color w:val="000000"/>
-        </w:rPr>
-      </w:pPr>
-      <w:r>
-        <w:rPr>
-          <w:color w:val="000000"/>
-        </w:rPr>
-        <w:t xml:space="preserve">{%p if </w:t>
+        <w:t xml:space="preserve">. </w:t>
+      </w:r>
+      <w:r>
+        <w:rPr>
+          <w:color w:val="222222"/>
+        </w:rPr>
+        <w:t xml:space="preserve">If the Respondent was served by mail, the green card signed by the Respondent (the return receipt) must also be filed. </w:t>
       </w:r>
       <w:proofErr w:type="spellStart"/>
       <w:r>
-        <w:t>has_next_friend_petitioning</w:t>
+        <w:rPr>
+          <w:color w:val="222222"/>
+        </w:rPr>
+        <w:t>MiFILE</w:t>
       </w:r>
       <w:proofErr w:type="spellEnd"/>
       <w:r>
         <w:rPr>
-          <w:color w:val="000000"/>
-        </w:rPr>
-        <w:t xml:space="preserve"> %}</w:t>
-      </w:r>
-    </w:p>
-    <w:p>
-      <w:pPr>
-        <w:pStyle w:val="Normalforinsertedinstructions"/>
-        <w:rPr>
-          <w:color w:val="000000"/>
-        </w:rPr>
-      </w:pPr>
-      <w:r>
-        <w:rPr>
-          <w:color w:val="000000"/>
-        </w:rPr>
-        <w:t>Your next friend will need to attend the hearing with you and speak on your behalf.</w:t>
-      </w:r>
-    </w:p>
-    <w:p>
-      <w:pPr>
-        <w:pStyle w:val="Normalforinsertedinstructions"/>
-        <w:rPr>
-          <w:color w:val="000000"/>
-        </w:rPr>
-      </w:pPr>
-      <w:r>
-        <w:rPr>
-          <w:color w:val="000000"/>
-        </w:rPr>
-        <w:t>{%p endif %}</w:t>
-      </w:r>
-    </w:p>
-    <w:p>
-      <w:pPr>
-        <w:pStyle w:val="Normalforinsertedinstructions"/>
-        <w:rPr>
-          <w:color w:val="000000"/>
-        </w:rPr>
-      </w:pPr>
-      <w:r>
-        <w:rPr>
-          <w:color w:val="000000"/>
-        </w:rPr>
-        <w:t xml:space="preserve">These are brief instructions about attending your court hearing. For more detailed instructions about going to court, watch the </w:t>
-      </w:r>
-      <w:hyperlink r:id="rId13">
-        <w:r>
-          <w:rPr>
-            <w:color w:val="0563C1"/>
-            <w:u w:val="single"/>
-          </w:rPr>
-          <w:t>Going to Court</w:t>
-        </w:r>
-      </w:hyperlink>
-      <w:r>
-        <w:rPr>
-          <w:color w:val="000000"/>
-        </w:rPr>
-        <w:t xml:space="preserve"> video.</w:t>
-      </w:r>
-    </w:p>
-    <w:p>
-      <w:pPr>
-        <w:pStyle w:val="Normalforinsertedinstructions"/>
-        <w:rPr>
-          <w:color w:val="000000"/>
-        </w:rPr>
-      </w:pPr>
-      <w:r>
-        <w:rPr>
-          <w:color w:val="000000"/>
-        </w:rPr>
-        <w:t>Your court hearing might be in person at the courthouse or online through the Zoom platform. Below you will find information about both types of hearings.</w:t>
-      </w:r>
-    </w:p>
-    <w:p>
-      <w:pPr>
-        <w:pStyle w:val="Heading4"/>
-      </w:pPr>
-      <w:r>
-        <w:lastRenderedPageBreak/>
-        <w:t>Zoom hearing:</w:t>
-      </w:r>
-    </w:p>
-    <w:p>
-      <w:pPr>
-        <w:pStyle w:val="Normalforinsertedinstructions"/>
-      </w:pPr>
-      <w:r>
-        <w:t>Follow the instructions provided by the court to connect to your Zoom hearing. This is a court proceeding and appropriate conduct and attire is required.</w:t>
-      </w:r>
-    </w:p>
-    <w:p>
-      <w:pPr>
-        <w:pStyle w:val="BulletedList"/>
-      </w:pPr>
-      <w:r>
-        <w:t>All participants are required to appear on camera.</w:t>
-      </w:r>
-    </w:p>
-    <w:p>
-      <w:pPr>
-        <w:pStyle w:val="BulletedList"/>
-      </w:pPr>
-      <w:r>
-        <w:t>The Court may permit a party’s request to appear by audio only if the individual does not have the technological ability to appear on camera.</w:t>
-      </w:r>
-    </w:p>
-    <w:p>
-      <w:pPr>
-        <w:pStyle w:val="BulletedList"/>
-      </w:pPr>
-      <w:r>
-        <w:t>Remote participants must use a private, indoor, quiet room with adequate lighting that will be free of interruptions.</w:t>
-      </w:r>
-    </w:p>
-    <w:p>
-      <w:pPr>
-        <w:pStyle w:val="BulletedList"/>
-      </w:pPr>
-      <w:r>
-        <w:t>The Court retains its contempt powers to sanction individuals participating remotely.</w:t>
-      </w:r>
-    </w:p>
-    <w:p>
-      <w:pPr>
-        <w:pStyle w:val="Normalforinsertedinstructions"/>
-      </w:pPr>
-      <w:r>
-        <w:t>Be prepared to answer questions from the judge about why you need a PPO. Answer the judge’s questions clearly and directly. The Respondent will also have a turn to speak.</w:t>
-      </w:r>
-    </w:p>
-    <w:p>
-      <w:pPr>
-        <w:pStyle w:val="Normalforinsertedinstructions"/>
-      </w:pPr>
-      <w:r>
-        <w:t>If the judge decides to grant you a PPO, the court will send you a copy of the order. You may want to make a copy for your employer, your child’s school or childcare provider, and several copies to keep in your home, car, etc. If the judge grants you a PPO, you will need to have the Respondent served with a copy of it (See Step 8).</w:t>
-      </w:r>
-    </w:p>
-    <w:p>
-      <w:pPr>
-        <w:pStyle w:val="Normalforinsertedinstructions"/>
-      </w:pPr>
-      <w:r>
-        <w:t>If the judge does not grant a PPO, the court will send you a copy of the denial order.</w:t>
-      </w:r>
-    </w:p>
-    <w:p>
-      <w:pPr>
-        <w:pStyle w:val="Heading4"/>
-      </w:pPr>
-      <w:r>
-        <w:t>Hearing at the courthouse:</w:t>
-      </w:r>
-    </w:p>
-    <w:p>
-      <w:pPr>
-        <w:pStyle w:val="Normalforinsertedinstructions"/>
-      </w:pPr>
-      <w:r>
-        <w:t>Go to the court on the scheduled day and time. Bring your proposed order to the hearing. Dress neatly. Arrive 10 or 15 minutes before your scheduled hearing time. Go to the clerk and tell them your name, that you are there for a hearing, and that you are representing yourself. Follow the clerk’s directions and do not interrupt any hearing in progress.</w:t>
-      </w:r>
-    </w:p>
-    <w:p>
-      <w:pPr>
-        <w:pStyle w:val="Normalforinsertedinstructions"/>
-      </w:pPr>
-      <w:r>
-        <w:t>Be prepared to answer questions from the judge about why you need a PPO.</w:t>
-      </w:r>
-    </w:p>
-    <w:p>
-      <w:pPr>
-        <w:pStyle w:val="Normalforinsertedinstructions"/>
-      </w:pPr>
-      <w:r>
-        <w:t>When you are called, go to the place you are directed and answer the judge’s questions clearly and directly. The Respondent will also have a turn to speak.</w:t>
-      </w:r>
-    </w:p>
-    <w:p>
-      <w:pPr>
-        <w:pStyle w:val="Normalforinsertedinstructions"/>
-      </w:pPr>
-      <w:r>
-        <w:t>If the judge decides to grant you a PPO, the judge will ask you for your order so they can fill it out and sign it. The court will give you and the Respondent a copy of the order. Ask the courtroom clerk for four (or more) copies of the order. You may want a copy for your employer, your child’s school or childcare provider, and several copies to keep in your home, car, etc.</w:t>
-      </w:r>
-    </w:p>
-    <w:p>
-      <w:pPr>
-        <w:pStyle w:val="Normalforinsertedinstructions"/>
-      </w:pPr>
-      <w:r>
-        <w:t>If the judge grants you a PPO, you will need to have the Respondent served with a copy of it (See Step 8).</w:t>
-      </w:r>
-    </w:p>
-    <w:p>
-      <w:pPr>
-        <w:pStyle w:val="Normalforinsertedinstructions"/>
-      </w:pPr>
-      <w:r>
-        <w:t>If the judge decides not to grant you a PPO, the court will give you an order denying a PPO.</w:t>
-      </w:r>
-    </w:p>
-    <w:p>
-      <w:pPr>
-        <w:pStyle w:val="Heading3"/>
-      </w:pPr>
-      <w:r>
-        <w:t>Step 8: Have the Respondent served with the order</w:t>
-      </w:r>
-    </w:p>
-    <w:p>
-      <w:pPr>
-        <w:pStyle w:val="Normalforinsertedinstructions"/>
-      </w:pPr>
-      <w:r>
-        <w:t>{%p if</w:t>
-      </w:r>
-      <w:r>
-        <w:t xml:space="preserve"> </w:t>
-      </w:r>
-      <w:proofErr w:type="spellStart"/>
-      <w:r>
-        <w:t>respondent_is_minor</w:t>
-      </w:r>
-      <w:proofErr w:type="spellEnd"/>
-      <w:r>
-        <w:t xml:space="preserve"> and not </w:t>
-      </w:r>
-      <w:proofErr w:type="spellStart"/>
-      <w:r>
-        <w:t>respondent_is_emancipated_minor</w:t>
-      </w:r>
-      <w:proofErr w:type="spellEnd"/>
-      <w:r>
-        <w:t xml:space="preserve"> %}</w:t>
-      </w:r>
-    </w:p>
-    <w:p>
-      <w:pPr>
-        <w:pStyle w:val="Normalforinsertedinstructions"/>
-        <w:rPr>
-          <w:b/>
-          <w:color w:val="000000"/>
-        </w:rPr>
-      </w:pPr>
-      <w:r>
-        <w:rPr>
-          <w:b/>
-          <w:color w:val="000000"/>
-        </w:rPr>
-        <w:t>If the respondent is a minor, also have a copy of the order served on the respondent’s parent(s), guardian(s), or custodian(s), if you know their location.</w:t>
-      </w:r>
-    </w:p>
-    <w:p>
-      <w:pPr>
-        <w:pStyle w:val="Normalforinsertedinstructions"/>
-      </w:pPr>
-      <w:r>
-        <w:t>{%p endif %}</w:t>
-      </w:r>
-    </w:p>
-    <w:p>
-      <w:pPr>
-        <w:pStyle w:val="Normalforinsertedinstructions"/>
-        <w:rPr>
-          <w:color w:val="000000"/>
-        </w:rPr>
-      </w:pPr>
-      <w:r>
-        <w:rPr>
-          <w:color w:val="000000"/>
-        </w:rPr>
-        <w:lastRenderedPageBreak/>
-        <w:t>If the court granted you a Personal Protection Order and they did not give a copy to the Respondent at the hearing, you must arrange to have the Respondent served with a copy.</w:t>
-      </w:r>
-    </w:p>
-    <w:p>
-      <w:pPr>
-        <w:pStyle w:val="Normalforinsertedinstructions"/>
-        <w:rPr>
-          <w:b/>
-          <w:color w:val="000000"/>
-        </w:rPr>
-      </w:pPr>
-      <w:r>
-        <w:rPr>
-          <w:b/>
-          <w:color w:val="000000"/>
-        </w:rPr>
-        <w:t>Have the Personal Protection Order served (sent or given to) the Respondent.</w:t>
-      </w:r>
-      <w:r>
-        <w:rPr>
-          <w:color w:val="000000"/>
-        </w:rPr>
-        <w:t xml:space="preserve"> This can be done by a police officer, professional process server, or someone else who is 18 years or older. </w:t>
-      </w:r>
-      <w:r>
-        <w:t xml:space="preserve">{% if </w:t>
-      </w:r>
-      <w:proofErr w:type="spellStart"/>
-      <w:r>
-        <w:t>has_next_friend_petitioning</w:t>
-      </w:r>
-      <w:proofErr w:type="spellEnd"/>
-      <w:r>
-        <w:t xml:space="preserve"> %}</w:t>
-      </w:r>
-      <w:r>
-        <w:rPr>
-          <w:b/>
-          <w:bCs/>
-          <w:color w:val="000000"/>
-        </w:rPr>
-        <w:t>Neither you nor your next friend is allowed to serve the Respondent.</w:t>
-      </w:r>
-      <w:r>
-        <w:t>{%</w:t>
-      </w:r>
-      <w:r>
-        <w:t xml:space="preserve"> else</w:t>
-      </w:r>
-      <w:r>
-        <w:t xml:space="preserve"> %}</w:t>
-      </w:r>
-      <w:r>
-        <w:rPr>
-          <w:b/>
-          <w:color w:val="000000"/>
-        </w:rPr>
-        <w:t>Do not serve the Respondent yourself.</w:t>
-      </w:r>
-      <w:r>
-        <w:t>{% endif %}</w:t>
-      </w:r>
-    </w:p>
-    <w:p>
-      <w:pPr>
-        <w:pStyle w:val="Normalforinsertedinstructions"/>
-        <w:rPr>
-          <w:color w:val="000000"/>
-        </w:rPr>
-      </w:pPr>
-      <w:r>
-        <w:rPr>
-          <w:color w:val="000000"/>
-        </w:rPr>
-        <w:t>If you would like the Sheriff’s Office Civil Unit to serve the respondent for you, you may go to the Civil Unit Office after your hearing to arrange service. The Sheriff’s Office Civil Unit Office is on the 1st floor of the courthouse, north entrance hallway, second door on the right. Their telephone number is 248-452-9725.</w:t>
-      </w:r>
-    </w:p>
-    <w:p>
-      <w:pPr>
-        <w:pStyle w:val="Normalforinsertedinstructions"/>
-        <w:rPr>
-          <w:color w:val="000000"/>
-        </w:rPr>
-      </w:pPr>
-      <w:r>
-        <w:rPr>
-          <w:color w:val="000000"/>
-        </w:rPr>
-        <w:t xml:space="preserve">The papers can also be served by registered mail with return receipt requested and delivery restricted to the Respondent. Even if the Respondent is served by mail, you need to find someone else to do the mailing. </w:t>
-      </w:r>
-      <w:r>
-        <w:rPr>
-          <w:color w:val="202124"/>
-        </w:rPr>
-        <w:t>The server’s address—not yours—should be the one on the return receipt.</w:t>
-      </w:r>
-      <w:r>
-        <w:rPr>
-          <w:color w:val="000000"/>
-        </w:rPr>
-        <w:t xml:space="preserve"> To learn more, read </w:t>
+          <w:color w:val="222222"/>
+        </w:rPr>
+        <w:t xml:space="preserve"> instructions can be found on the </w:t>
       </w:r>
       <w:hyperlink r:id="rId14">
-        <w:r>
-          <w:rPr>
-            <w:color w:val="0563C1"/>
-            <w:u w:val="single"/>
-          </w:rPr>
-          <w:t>Serving Your Personal Protection Order</w:t>
-        </w:r>
-      </w:hyperlink>
-      <w:r>
-        <w:rPr>
-          <w:color w:val="000000"/>
-        </w:rPr>
-        <w:t>.</w:t>
-      </w:r>
-    </w:p>
-    <w:p>
-      <w:pPr>
-        <w:pStyle w:val="Normalforinsertedinstructions"/>
-        <w:rPr>
-          <w:color w:val="000000"/>
-        </w:rPr>
-      </w:pPr>
-      <w:r>
-        <w:rPr>
-          <w:color w:val="000000"/>
-        </w:rPr>
-        <w:t>If the judge signed an order denying a PPO, the court will take care of serving the Respondent with the denial order.</w:t>
-      </w:r>
-    </w:p>
-    <w:p>
-      <w:pPr>
-        <w:pStyle w:val="Heading3"/>
-      </w:pPr>
-      <w:r>
-        <w:t>Step 9: File the completed Proof of Service</w:t>
-      </w:r>
-    </w:p>
-    <w:p>
-      <w:pPr>
-        <w:pStyle w:val="Normalforinsertedinstructions"/>
-        <w:rPr>
-          <w:color w:val="000000"/>
-        </w:rPr>
-      </w:pPr>
-      <w:r>
-        <w:rPr>
-          <w:color w:val="000000"/>
-        </w:rPr>
-        <w:t xml:space="preserve">{%p if </w:t>
-      </w:r>
-      <w:proofErr w:type="spellStart"/>
-      <w:r>
-        <w:t>has_next_friend_petitioning</w:t>
-      </w:r>
-      <w:proofErr w:type="spellEnd"/>
-      <w:r>
-        <w:rPr>
-          <w:color w:val="000000"/>
-        </w:rPr>
-        <w:t xml:space="preserve"> %}</w:t>
-      </w:r>
-    </w:p>
-    <w:p>
-      <w:pPr>
-        <w:pStyle w:val="Normalforinsertedinstructions"/>
-        <w:rPr>
-          <w:color w:val="000000"/>
-        </w:rPr>
-      </w:pPr>
-      <w:r>
-        <w:rPr>
-          <w:color w:val="000000"/>
-        </w:rPr>
-        <w:t>Your next friend will need to complete this step for you.</w:t>
-      </w:r>
-    </w:p>
-    <w:p>
-      <w:pPr>
-        <w:pStyle w:val="Normalforinsertedinstructions"/>
-        <w:rPr>
-          <w:color w:val="000000"/>
-        </w:rPr>
-      </w:pPr>
-      <w:r>
-        <w:rPr>
-          <w:color w:val="000000"/>
-        </w:rPr>
-        <w:t>{%p endif %}</w:t>
-      </w:r>
-    </w:p>
-    <w:p>
-      <w:pPr>
-        <w:pStyle w:val="Normalforinsertedinstructions"/>
-        <w:rPr>
-          <w:color w:val="000000"/>
-        </w:rPr>
-      </w:pPr>
-      <w:r>
-        <w:rPr>
-          <w:color w:val="000000"/>
-        </w:rPr>
-        <w:t>When you used the Do-It-Yourself Personal Protection Order (PPO) tool, you got a Proof of Service with the PPO.</w:t>
-      </w:r>
-    </w:p>
-    <w:p>
-      <w:pPr>
-        <w:pStyle w:val="Normalforinsertedinstructions"/>
-      </w:pPr>
-      <w:r>
-        <w:t xml:space="preserve">Have the server complete and sign the Proof of Service. This tells the court how and where the Respondent was served with the PPO. </w:t>
-      </w:r>
-    </w:p>
-    <w:p>
-      <w:pPr>
-        <w:pStyle w:val="Normalforinsertedinstructions"/>
-        <w:rPr>
-          <w:color w:val="000000"/>
-        </w:rPr>
-      </w:pPr>
-      <w:r>
-        <w:rPr>
-          <w:color w:val="222222"/>
-        </w:rPr>
-        <w:t xml:space="preserve">Make sure that you file the Proof of Service with the court through </w:t>
-      </w:r>
-      <w:hyperlink r:id="rId15" w:history="1">
-        <w:proofErr w:type="spellStart"/>
-        <w:r>
-          <w:rPr>
-            <w:color w:val="0563C1"/>
-            <w:u w:val="single"/>
-          </w:rPr>
-          <w:t>MiFILE</w:t>
-        </w:r>
-        <w:proofErr w:type="spellEnd"/>
-      </w:hyperlink>
-      <w:r>
-        <w:rPr>
-          <w:color w:val="000000"/>
-        </w:rPr>
-        <w:t xml:space="preserve">. </w:t>
-      </w:r>
-      <w:r>
-        <w:rPr>
-          <w:color w:val="222222"/>
-        </w:rPr>
-        <w:t xml:space="preserve">If the Respondent was served by mail, the green card signed by the Respondent (the return receipt) must also be filed. </w:t>
-      </w:r>
-      <w:proofErr w:type="spellStart"/>
-      <w:r>
-        <w:rPr>
-          <w:color w:val="222222"/>
-        </w:rPr>
-        <w:t>MiFILE</w:t>
-      </w:r>
-      <w:proofErr w:type="spellEnd"/>
-      <w:r>
-        <w:rPr>
-          <w:color w:val="222222"/>
-        </w:rPr>
-        <w:t xml:space="preserve"> instructions can be found on the </w:t>
-      </w:r>
-      <w:hyperlink r:id="rId16">
         <w:r>
           <w:rPr>
             <w:color w:val="0563C1"/>
@@ -1979,7 +2086,15 @@
         <w:pStyle w:val="Normalforinsertedinstructions"/>
       </w:pPr>
       <w:r>
-        <w:t>After you have your PPO, you can enforce it by calling the police if the Respondent ever violates it. It is a good idea to keep a copy of your PPO and Proof of Service with you at all times because it will make enforcement easier if it becomes necessary.</w:t>
+        <w:t xml:space="preserve">After you have your PPO, you can enforce it by calling the police if the Respondent ever violates it. It is a good idea to </w:t>
+      </w:r>
+      <w:proofErr w:type="gramStart"/>
+      <w:r>
+        <w:t>keep a copy of your PPO and Proof of Service with you at all times</w:t>
+      </w:r>
+      <w:proofErr w:type="gramEnd"/>
+      <w:r>
+        <w:t xml:space="preserve"> because it will make enforcement easier if it becomes necessary.</w:t>
       </w:r>
     </w:p>
     <w:p>
@@ -1995,20 +2110,34 @@
         </w:rPr>
         <w:t xml:space="preserve">If the Respondent violates the PPO and they are not arrested, also call the PPO Office or e-mail them at </w:t>
       </w:r>
-      <w:hyperlink r:id="rId17" w:history="1">
+      <w:hyperlink r:id="rId15">
         <w:r>
           <w:rPr>
             <w:color w:val="0563C1"/>
             <w:u w:val="single"/>
           </w:rPr>
-          <w:t>ppo@oaklandcountymi.gov</w:t>
+          <w:t>PPO@oakgov.com</w:t>
         </w:r>
       </w:hyperlink>
       <w:r>
         <w:rPr>
           <w:color w:val="000000"/>
         </w:rPr>
-        <w:t xml:space="preserve"> for instructions on how to report the violation to the court. Even if you filed a police report, the police will not report the violation to the court. If you want the court to know about the violation, you must report the violation to the court.</w:t>
+        <w:t xml:space="preserve"> for instructions on how to report the violation to the court. Even if you filed a police report, the police </w:t>
+      </w:r>
+      <w:proofErr w:type="gramStart"/>
+      <w:r>
+        <w:rPr>
+          <w:color w:val="000000"/>
+        </w:rPr>
+        <w:t>will</w:t>
+      </w:r>
+      <w:proofErr w:type="gramEnd"/>
+      <w:r>
+        <w:rPr>
+          <w:color w:val="000000"/>
+        </w:rPr>
+        <w:t xml:space="preserve"> not report the violation to the court. If you want the court to know about the violation, you must report the violation to the court.</w:t>
       </w:r>
     </w:p>
     <w:sectPr>
@@ -2478,155 +2607,6 @@
     </w:lvl>
   </w:abstractNum>
   <w:abstractNum w:abstractNumId="4" w15:restartNumberingAfterBreak="0">
-    <w:nsid w:val="76805626"/>
-    <w:multiLevelType w:val="multilevel"/>
-    <w:tmpl w:val="5FCA621A"/>
-    <w:lvl w:ilvl="0">
-      <w:start w:val="1"/>
-      <w:numFmt w:val="bullet"/>
-      <w:lvlText w:val=""/>
-      <w:lvlJc w:val="left"/>
-      <w:pPr>
-        <w:tabs>
-          <w:tab w:val="num" w:pos="720"/>
-        </w:tabs>
-        <w:ind w:left="720" w:hanging="360"/>
-      </w:pPr>
-      <w:rPr>
-        <w:rFonts w:ascii="Symbol" w:hAnsi="Symbol" w:hint="default"/>
-        <w:sz w:val="20"/>
-      </w:rPr>
-    </w:lvl>
-    <w:lvl w:ilvl="1" w:tentative="1">
-      <w:start w:val="1"/>
-      <w:numFmt w:val="bullet"/>
-      <w:lvlText w:val="o"/>
-      <w:lvlJc w:val="left"/>
-      <w:pPr>
-        <w:tabs>
-          <w:tab w:val="num" w:pos="1440"/>
-        </w:tabs>
-        <w:ind w:left="1440" w:hanging="360"/>
-      </w:pPr>
-      <w:rPr>
-        <w:rFonts w:ascii="Courier New" w:hAnsi="Courier New" w:hint="default"/>
-        <w:sz w:val="20"/>
-      </w:rPr>
-    </w:lvl>
-    <w:lvl w:ilvl="2" w:tentative="1">
-      <w:start w:val="1"/>
-      <w:numFmt w:val="bullet"/>
-      <w:lvlText w:val=""/>
-      <w:lvlJc w:val="left"/>
-      <w:pPr>
-        <w:tabs>
-          <w:tab w:val="num" w:pos="2160"/>
-        </w:tabs>
-        <w:ind w:left="2160" w:hanging="360"/>
-      </w:pPr>
-      <w:rPr>
-        <w:rFonts w:ascii="Wingdings" w:hAnsi="Wingdings" w:hint="default"/>
-        <w:sz w:val="20"/>
-      </w:rPr>
-    </w:lvl>
-    <w:lvl w:ilvl="3" w:tentative="1">
-      <w:start w:val="1"/>
-      <w:numFmt w:val="bullet"/>
-      <w:lvlText w:val=""/>
-      <w:lvlJc w:val="left"/>
-      <w:pPr>
-        <w:tabs>
-          <w:tab w:val="num" w:pos="2880"/>
-        </w:tabs>
-        <w:ind w:left="2880" w:hanging="360"/>
-      </w:pPr>
-      <w:rPr>
-        <w:rFonts w:ascii="Wingdings" w:hAnsi="Wingdings" w:hint="default"/>
-        <w:sz w:val="20"/>
-      </w:rPr>
-    </w:lvl>
-    <w:lvl w:ilvl="4" w:tentative="1">
-      <w:start w:val="1"/>
-      <w:numFmt w:val="bullet"/>
-      <w:lvlText w:val=""/>
-      <w:lvlJc w:val="left"/>
-      <w:pPr>
-        <w:tabs>
-          <w:tab w:val="num" w:pos="3600"/>
-        </w:tabs>
-        <w:ind w:left="3600" w:hanging="360"/>
-      </w:pPr>
-      <w:rPr>
-        <w:rFonts w:ascii="Wingdings" w:hAnsi="Wingdings" w:hint="default"/>
-        <w:sz w:val="20"/>
-      </w:rPr>
-    </w:lvl>
-    <w:lvl w:ilvl="5" w:tentative="1">
-      <w:start w:val="1"/>
-      <w:numFmt w:val="bullet"/>
-      <w:lvlText w:val=""/>
-      <w:lvlJc w:val="left"/>
-      <w:pPr>
-        <w:tabs>
-          <w:tab w:val="num" w:pos="4320"/>
-        </w:tabs>
-        <w:ind w:left="4320" w:hanging="360"/>
-      </w:pPr>
-      <w:rPr>
-        <w:rFonts w:ascii="Wingdings" w:hAnsi="Wingdings" w:hint="default"/>
-        <w:sz w:val="20"/>
-      </w:rPr>
-    </w:lvl>
-    <w:lvl w:ilvl="6" w:tentative="1">
-      <w:start w:val="1"/>
-      <w:numFmt w:val="bullet"/>
-      <w:lvlText w:val=""/>
-      <w:lvlJc w:val="left"/>
-      <w:pPr>
-        <w:tabs>
-          <w:tab w:val="num" w:pos="5040"/>
-        </w:tabs>
-        <w:ind w:left="5040" w:hanging="360"/>
-      </w:pPr>
-      <w:rPr>
-        <w:rFonts w:ascii="Wingdings" w:hAnsi="Wingdings" w:hint="default"/>
-        <w:sz w:val="20"/>
-      </w:rPr>
-    </w:lvl>
-    <w:lvl w:ilvl="7" w:tentative="1">
-      <w:start w:val="1"/>
-      <w:numFmt w:val="bullet"/>
-      <w:lvlText w:val=""/>
-      <w:lvlJc w:val="left"/>
-      <w:pPr>
-        <w:tabs>
-          <w:tab w:val="num" w:pos="5760"/>
-        </w:tabs>
-        <w:ind w:left="5760" w:hanging="360"/>
-      </w:pPr>
-      <w:rPr>
-        <w:rFonts w:ascii="Wingdings" w:hAnsi="Wingdings" w:hint="default"/>
-        <w:sz w:val="20"/>
-      </w:rPr>
-    </w:lvl>
-    <w:lvl w:ilvl="8" w:tentative="1">
-      <w:start w:val="1"/>
-      <w:numFmt w:val="bullet"/>
-      <w:lvlText w:val=""/>
-      <w:lvlJc w:val="left"/>
-      <w:pPr>
-        <w:tabs>
-          <w:tab w:val="num" w:pos="6480"/>
-        </w:tabs>
-        <w:ind w:left="6480" w:hanging="360"/>
-      </w:pPr>
-      <w:rPr>
-        <w:rFonts w:ascii="Wingdings" w:hAnsi="Wingdings" w:hint="default"/>
-        <w:sz w:val="20"/>
-      </w:rPr>
-    </w:lvl>
-  </w:abstractNum>
-  <w:abstractNum w:abstractNumId="5" w15:restartNumberingAfterBreak="0">
     <w:nsid w:val="79627113"/>
     <w:multiLevelType w:val="multilevel"/>
     <w:tmpl w:val="670CB82A"/>
@@ -2747,16 +2727,13 @@
     <w:abstractNumId w:val="3"/>
   </w:num>
   <w:num w:numId="3" w16cid:durableId="308945251">
-    <w:abstractNumId w:val="5"/>
+    <w:abstractNumId w:val="4"/>
   </w:num>
   <w:num w:numId="4" w16cid:durableId="1048917367">
     <w:abstractNumId w:val="1"/>
   </w:num>
   <w:num w:numId="5" w16cid:durableId="240061563">
     <w:abstractNumId w:val="0"/>
-  </w:num>
-  <w:num w:numId="6" w16cid:durableId="1995446447">
-    <w:abstractNumId w:val="4"/>
   </w:num>
 </w:numbering>
 </file>
@@ -3426,17 +3403,6 @@
     <w:qFormat/>
     <w:rsid w:val="00722FB9"/>
   </w:style>
-  <w:style w:type="character" w:styleId="Hyperlink">
-    <w:name w:val="Hyperlink"/>
-    <w:basedOn w:val="DefaultParagraphFont"/>
-    <w:uiPriority w:val="99"/>
-    <w:unhideWhenUsed/>
-    <w:rsid w:val="00F07F03"/>
-    <w:rPr>
-      <w:color w:val="0000FF" w:themeColor="hyperlink"/>
-      <w:u w:val="single"/>
-    </w:rPr>
-  </w:style>
 </w:styles>
 </file>
 

</xml_diff>